<commit_message>
Flere løsninger og oppdaterte oppgaver
</commit_message>
<xml_diff>
--- a/arbeidshefter_r1_word/1_algebra_potenser_og_rotter.docx
+++ b/arbeidshefter_r1_word/1_algebra_potenser_og_rotter.docx
@@ -1,6 +1,6 @@
 
 <file path=word/document.xml><?xml version="1.0" encoding="utf-8"?>
-<w:document xmlns:wpc="http://schemas.microsoft.com/office/word/2010/wordprocessingCanvas" xmlns:cx="http://schemas.microsoft.com/office/drawing/2014/chartex" xmlns:cx1="http://schemas.microsoft.com/office/drawing/2015/9/8/chartex" xmlns:cx2="http://schemas.microsoft.com/office/drawing/2015/10/21/chartex" xmlns:cx3="http://schemas.microsoft.com/office/drawing/2016/5/9/chartex" xmlns:cx4="http://schemas.microsoft.com/office/drawing/2016/5/10/chartex" xmlns:cx5="http://schemas.microsoft.com/office/drawing/2016/5/11/chartex" xmlns:cx6="http://schemas.microsoft.com/office/drawing/2016/5/12/chartex" xmlns:cx7="http://schemas.microsoft.com/office/drawing/2016/5/13/chartex" xmlns:cx8="http://schemas.microsoft.com/office/drawing/2016/5/14/chartex" xmlns:mc="http://schemas.openxmlformats.org/markup-compatibility/2006" xmlns:aink="http://schemas.microsoft.com/office/drawing/2016/ink" xmlns:am3d="http://schemas.microsoft.com/office/drawing/2017/model3d" xmlns:o="urn:schemas-microsoft-com:office:office" xmlns:oel="http://schemas.microsoft.com/office/2019/extlst" xmlns:r="http://schemas.openxmlformats.org/officeDocument/2006/relationships" xmlns:m="http://schemas.openxmlformats.org/officeDocument/2006/math" xmlns:v="urn:schemas-microsoft-com:vml" xmlns:wp14="http://schemas.microsoft.com/office/word/2010/wordprocessingDrawing" xmlns:wp="http://schemas.openxmlformats.org/drawingml/2006/wordprocessingDrawing" xmlns:w10="urn:schemas-microsoft-com:office:word" xmlns:w="http://schemas.openxmlformats.org/wordprocessingml/2006/main" xmlns:w14="http://schemas.microsoft.com/office/word/2010/wordml" xmlns:w15="http://schemas.microsoft.com/office/word/2012/wordml" xmlns:w16cei="http://schemas.microsoft.com/office/word/2026/wordml/cei" xmlns:w16cex="http://schemas.microsoft.com/office/word/2018/wordml/cex" xmlns:w16cid="http://schemas.microsoft.com/office/word/2016/wordml/cid" xmlns:w16="http://schemas.microsoft.com/office/word/2018/wordml" xmlns:w16du="http://schemas.microsoft.com/office/word/2023/wordml/word16du" xmlns:w16sdtdh="http://schemas.microsoft.com/office/word/2020/wordml/sdtdatahash" xmlns:w16sdtfl="http://schemas.microsoft.com/office/word/2024/wordml/sdtformatlock" xmlns:w16se="http://schemas.microsoft.com/office/word/2015/wordml/symex" xmlns:wpg="http://schemas.microsoft.com/office/word/2010/wordprocessingGroup" xmlns:wpi="http://schemas.microsoft.com/office/word/2010/wordprocessingInk" xmlns:wne="http://schemas.microsoft.com/office/word/2006/wordml" xmlns:wps="http://schemas.microsoft.com/office/word/2010/wordprocessingShape" mc:Ignorable="w14 w15 w16se w16cid w16 w16cex w16sdtdh w16sdtfl w16du wp14">
+<w:document xmlns:wpc="http://schemas.microsoft.com/office/word/2010/wordprocessingCanvas" xmlns:cx="http://schemas.microsoft.com/office/drawing/2014/chartex" xmlns:cx1="http://schemas.microsoft.com/office/drawing/2015/9/8/chartex" xmlns:cx2="http://schemas.microsoft.com/office/drawing/2015/10/21/chartex" xmlns:cx3="http://schemas.microsoft.com/office/drawing/2016/5/9/chartex" xmlns:cx4="http://schemas.microsoft.com/office/drawing/2016/5/10/chartex" xmlns:cx5="http://schemas.microsoft.com/office/drawing/2016/5/11/chartex" xmlns:cx6="http://schemas.microsoft.com/office/drawing/2016/5/12/chartex" xmlns:cx7="http://schemas.microsoft.com/office/drawing/2016/5/13/chartex" xmlns:cx8="http://schemas.microsoft.com/office/drawing/2016/5/14/chartex" xmlns:mc="http://schemas.openxmlformats.org/markup-compatibility/2006" xmlns:aink="http://schemas.microsoft.com/office/drawing/2016/ink" xmlns:am3d="http://schemas.microsoft.com/office/drawing/2017/model3d" xmlns:o="urn:schemas-microsoft-com:office:office" xmlns:oel="http://schemas.microsoft.com/office/2019/extlst" xmlns:r="http://schemas.openxmlformats.org/officeDocument/2006/relationships" xmlns:m="http://schemas.openxmlformats.org/officeDocument/2006/math" xmlns:v="urn:schemas-microsoft-com:vml" xmlns:wp14="http://schemas.microsoft.com/office/word/2010/wordprocessingDrawing" xmlns:wp="http://schemas.openxmlformats.org/drawingml/2006/wordprocessingDrawing" xmlns:w10="urn:schemas-microsoft-com:office:word" xmlns:w="http://schemas.openxmlformats.org/wordprocessingml/2006/main" xmlns:w14="http://schemas.microsoft.com/office/word/2010/wordml" xmlns:w15="http://schemas.microsoft.com/office/word/2012/wordml" xmlns:w16cex="http://schemas.microsoft.com/office/word/2018/wordml/cex" xmlns:w16cid="http://schemas.microsoft.com/office/word/2016/wordml/cid" xmlns:w16="http://schemas.microsoft.com/office/word/2018/wordml" xmlns:w16du="http://schemas.microsoft.com/office/word/2023/wordml/word16du" xmlns:w16sdtdh="http://schemas.microsoft.com/office/word/2020/wordml/sdtdatahash" xmlns:w16sdtfl="http://schemas.microsoft.com/office/word/2024/wordml/sdtformatlock" xmlns:w16se="http://schemas.microsoft.com/office/word/2015/wordml/symex" xmlns:wpg="http://schemas.microsoft.com/office/word/2010/wordprocessingGroup" xmlns:wpi="http://schemas.microsoft.com/office/word/2010/wordprocessingInk" xmlns:wne="http://schemas.microsoft.com/office/word/2006/wordml" xmlns:wps="http://schemas.microsoft.com/office/word/2010/wordprocessingShape" mc:Ignorable="w14 w15 w16se w16cid w16 w16cex w16sdtdh w16sdtfl w16du wp14">
   <w:body>
     <w:p>
       <w:pPr>
@@ -3523,23 +3523,7 @@
           <w:sz w:val="24"/>
           <w:szCs w:val="24"/>
         </w:rPr>
-        <w:t xml:space="preserve">Regn ut, og sorter tallene i stigende rekkefølge fra minste verdi til </w:t>
-      </w:r>
-      <w:proofErr w:type="spellStart"/>
-      <w:r>
-        <w:rPr>
-          <w:sz w:val="24"/>
-          <w:szCs w:val="24"/>
-        </w:rPr>
-        <w:t>største</w:t>
-      </w:r>
-      <w:proofErr w:type="spellEnd"/>
-      <w:r>
-        <w:rPr>
-          <w:sz w:val="24"/>
-          <w:szCs w:val="24"/>
-        </w:rPr>
-        <w:t xml:space="preserve"> verdi. </w:t>
+        <w:t xml:space="preserve">Regn ut, og sorter tallene i stigende rekkefølge fra minste verdi til største verdi. </w:t>
       </w:r>
     </w:p>
     <w:p>
@@ -4576,7 +4560,6 @@
         </w:rPr>
         <w:t xml:space="preserve">Trekk ut så mye som mulig fra </w:t>
       </w:r>
-      <w:proofErr w:type="spellStart"/>
       <w:proofErr w:type="gramStart"/>
       <w:r>
         <w:rPr>
@@ -4584,16 +4567,7 @@
           <w:sz w:val="24"/>
           <w:szCs w:val="24"/>
         </w:rPr>
-        <w:t>rotuttrykket</w:t>
-      </w:r>
-      <w:proofErr w:type="spellEnd"/>
-      <w:r>
-        <w:rPr>
-          <w:rFonts w:eastAsiaTheme="minorEastAsia"/>
-          <w:sz w:val="24"/>
-          <w:szCs w:val="24"/>
-        </w:rPr>
-        <w:t xml:space="preserve">  (</w:t>
+        <w:t>rotuttrykket  (</w:t>
       </w:r>
       <w:proofErr w:type="gramEnd"/>
       <w:r>
@@ -5287,7 +5261,7 @@
                     <w:sz w:val="24"/>
                     <w:szCs w:val="24"/>
                   </w:rPr>
-                  <m:t>3</m:t>
+                  <m:t>2</m:t>
                 </m:r>
               </m:num>
               <m:den>
@@ -5297,7 +5271,7 @@
                     <w:sz w:val="24"/>
                     <w:szCs w:val="24"/>
                   </w:rPr>
-                  <m:t>2</m:t>
+                  <m:t>3</m:t>
                 </m:r>
               </m:den>
             </m:f>
@@ -9991,7 +9965,15 @@
             <w:sz w:val="24"/>
             <w:szCs w:val="24"/>
           </w:rPr>
-          <m:t>5 </m:t>
+          <m:t>5</m:t>
+        </m:r>
+        <m:r>
+          <w:rPr>
+            <w:rFonts w:ascii="Cambria Math" w:hAnsi="Cambria Math"/>
+            <w:sz w:val="24"/>
+            <w:szCs w:val="24"/>
+          </w:rPr>
+          <m:t> </m:t>
         </m:r>
       </m:oMath>
     </w:p>
@@ -11403,7 +11385,7 @@
 </file>
 
 <file path=word/endnotes.xml><?xml version="1.0" encoding="utf-8"?>
-<w:endnotes xmlns:wpc="http://schemas.microsoft.com/office/word/2010/wordprocessingCanvas" xmlns:cx="http://schemas.microsoft.com/office/drawing/2014/chartex" xmlns:cx1="http://schemas.microsoft.com/office/drawing/2015/9/8/chartex" xmlns:cx2="http://schemas.microsoft.com/office/drawing/2015/10/21/chartex" xmlns:cx3="http://schemas.microsoft.com/office/drawing/2016/5/9/chartex" xmlns:cx4="http://schemas.microsoft.com/office/drawing/2016/5/10/chartex" xmlns:cx5="http://schemas.microsoft.com/office/drawing/2016/5/11/chartex" xmlns:cx6="http://schemas.microsoft.com/office/drawing/2016/5/12/chartex" xmlns:cx7="http://schemas.microsoft.com/office/drawing/2016/5/13/chartex" xmlns:cx8="http://schemas.microsoft.com/office/drawing/2016/5/14/chartex" xmlns:mc="http://schemas.openxmlformats.org/markup-compatibility/2006" xmlns:aink="http://schemas.microsoft.com/office/drawing/2016/ink" xmlns:am3d="http://schemas.microsoft.com/office/drawing/2017/model3d" xmlns:o="urn:schemas-microsoft-com:office:office" xmlns:oel="http://schemas.microsoft.com/office/2019/extlst" xmlns:r="http://schemas.openxmlformats.org/officeDocument/2006/relationships" xmlns:m="http://schemas.openxmlformats.org/officeDocument/2006/math" xmlns:v="urn:schemas-microsoft-com:vml" xmlns:wp14="http://schemas.microsoft.com/office/word/2010/wordprocessingDrawing" xmlns:wp="http://schemas.openxmlformats.org/drawingml/2006/wordprocessingDrawing" xmlns:w10="urn:schemas-microsoft-com:office:word" xmlns:w="http://schemas.openxmlformats.org/wordprocessingml/2006/main" xmlns:w14="http://schemas.microsoft.com/office/word/2010/wordml" xmlns:w15="http://schemas.microsoft.com/office/word/2012/wordml" xmlns:w16cei="http://schemas.microsoft.com/office/word/2026/wordml/cei" xmlns:w16cex="http://schemas.microsoft.com/office/word/2018/wordml/cex" xmlns:w16cid="http://schemas.microsoft.com/office/word/2016/wordml/cid" xmlns:w16="http://schemas.microsoft.com/office/word/2018/wordml" xmlns:w16du="http://schemas.microsoft.com/office/word/2023/wordml/word16du" xmlns:w16sdtdh="http://schemas.microsoft.com/office/word/2020/wordml/sdtdatahash" xmlns:w16sdtfl="http://schemas.microsoft.com/office/word/2024/wordml/sdtformatlock" xmlns:w16se="http://schemas.microsoft.com/office/word/2015/wordml/symex" xmlns:wpg="http://schemas.microsoft.com/office/word/2010/wordprocessingGroup" xmlns:wpi="http://schemas.microsoft.com/office/word/2010/wordprocessingInk" xmlns:wne="http://schemas.microsoft.com/office/word/2006/wordml" xmlns:wps="http://schemas.microsoft.com/office/word/2010/wordprocessingShape" mc:Ignorable="w14 w15 w16se w16cid w16 w16cex w16sdtdh w16sdtfl w16du wp14">
+<w:endnotes xmlns:wpc="http://schemas.microsoft.com/office/word/2010/wordprocessingCanvas" xmlns:cx="http://schemas.microsoft.com/office/drawing/2014/chartex" xmlns:cx1="http://schemas.microsoft.com/office/drawing/2015/9/8/chartex" xmlns:cx2="http://schemas.microsoft.com/office/drawing/2015/10/21/chartex" xmlns:cx3="http://schemas.microsoft.com/office/drawing/2016/5/9/chartex" xmlns:cx4="http://schemas.microsoft.com/office/drawing/2016/5/10/chartex" xmlns:cx5="http://schemas.microsoft.com/office/drawing/2016/5/11/chartex" xmlns:cx6="http://schemas.microsoft.com/office/drawing/2016/5/12/chartex" xmlns:cx7="http://schemas.microsoft.com/office/drawing/2016/5/13/chartex" xmlns:cx8="http://schemas.microsoft.com/office/drawing/2016/5/14/chartex" xmlns:mc="http://schemas.openxmlformats.org/markup-compatibility/2006" xmlns:aink="http://schemas.microsoft.com/office/drawing/2016/ink" xmlns:am3d="http://schemas.microsoft.com/office/drawing/2017/model3d" xmlns:o="urn:schemas-microsoft-com:office:office" xmlns:oel="http://schemas.microsoft.com/office/2019/extlst" xmlns:r="http://schemas.openxmlformats.org/officeDocument/2006/relationships" xmlns:m="http://schemas.openxmlformats.org/officeDocument/2006/math" xmlns:v="urn:schemas-microsoft-com:vml" xmlns:wp14="http://schemas.microsoft.com/office/word/2010/wordprocessingDrawing" xmlns:wp="http://schemas.openxmlformats.org/drawingml/2006/wordprocessingDrawing" xmlns:w10="urn:schemas-microsoft-com:office:word" xmlns:w="http://schemas.openxmlformats.org/wordprocessingml/2006/main" xmlns:w14="http://schemas.microsoft.com/office/word/2010/wordml" xmlns:w15="http://schemas.microsoft.com/office/word/2012/wordml" xmlns:w16cex="http://schemas.microsoft.com/office/word/2018/wordml/cex" xmlns:w16cid="http://schemas.microsoft.com/office/word/2016/wordml/cid" xmlns:w16="http://schemas.microsoft.com/office/word/2018/wordml" xmlns:w16du="http://schemas.microsoft.com/office/word/2023/wordml/word16du" xmlns:w16sdtdh="http://schemas.microsoft.com/office/word/2020/wordml/sdtdatahash" xmlns:w16sdtfl="http://schemas.microsoft.com/office/word/2024/wordml/sdtformatlock" xmlns:w16se="http://schemas.microsoft.com/office/word/2015/wordml/symex" xmlns:wpg="http://schemas.microsoft.com/office/word/2010/wordprocessingGroup" xmlns:wpi="http://schemas.microsoft.com/office/word/2010/wordprocessingInk" xmlns:wne="http://schemas.microsoft.com/office/word/2006/wordml" xmlns:wps="http://schemas.microsoft.com/office/word/2010/wordprocessingShape" mc:Ignorable="w14 w15 w16se w16cid w16 w16cex w16sdtdh w16sdtfl w16du wp14">
   <w:endnote w:type="separator" w:id="-1">
     <w:p>
       <w:pPr>
@@ -11428,7 +11410,7 @@
 </file>
 
 <file path=word/footer1.xml><?xml version="1.0" encoding="utf-8"?>
-<w:ftr xmlns:wpc="http://schemas.microsoft.com/office/word/2010/wordprocessingCanvas" xmlns:cx="http://schemas.microsoft.com/office/drawing/2014/chartex" xmlns:cx1="http://schemas.microsoft.com/office/drawing/2015/9/8/chartex" xmlns:cx2="http://schemas.microsoft.com/office/drawing/2015/10/21/chartex" xmlns:cx3="http://schemas.microsoft.com/office/drawing/2016/5/9/chartex" xmlns:cx4="http://schemas.microsoft.com/office/drawing/2016/5/10/chartex" xmlns:cx5="http://schemas.microsoft.com/office/drawing/2016/5/11/chartex" xmlns:cx6="http://schemas.microsoft.com/office/drawing/2016/5/12/chartex" xmlns:cx7="http://schemas.microsoft.com/office/drawing/2016/5/13/chartex" xmlns:cx8="http://schemas.microsoft.com/office/drawing/2016/5/14/chartex" xmlns:mc="http://schemas.openxmlformats.org/markup-compatibility/2006" xmlns:aink="http://schemas.microsoft.com/office/drawing/2016/ink" xmlns:am3d="http://schemas.microsoft.com/office/drawing/2017/model3d" xmlns:o="urn:schemas-microsoft-com:office:office" xmlns:oel="http://schemas.microsoft.com/office/2019/extlst" xmlns:r="http://schemas.openxmlformats.org/officeDocument/2006/relationships" xmlns:m="http://schemas.openxmlformats.org/officeDocument/2006/math" xmlns:v="urn:schemas-microsoft-com:vml" xmlns:wp14="http://schemas.microsoft.com/office/word/2010/wordprocessingDrawing" xmlns:wp="http://schemas.openxmlformats.org/drawingml/2006/wordprocessingDrawing" xmlns:w10="urn:schemas-microsoft-com:office:word" xmlns:w="http://schemas.openxmlformats.org/wordprocessingml/2006/main" xmlns:w14="http://schemas.microsoft.com/office/word/2010/wordml" xmlns:w15="http://schemas.microsoft.com/office/word/2012/wordml" xmlns:w16cei="http://schemas.microsoft.com/office/word/2026/wordml/cei" xmlns:w16cex="http://schemas.microsoft.com/office/word/2018/wordml/cex" xmlns:w16cid="http://schemas.microsoft.com/office/word/2016/wordml/cid" xmlns:w16="http://schemas.microsoft.com/office/word/2018/wordml" xmlns:w16du="http://schemas.microsoft.com/office/word/2023/wordml/word16du" xmlns:w16sdtdh="http://schemas.microsoft.com/office/word/2020/wordml/sdtdatahash" xmlns:w16sdtfl="http://schemas.microsoft.com/office/word/2024/wordml/sdtformatlock" xmlns:w16se="http://schemas.microsoft.com/office/word/2015/wordml/symex" xmlns:wpg="http://schemas.microsoft.com/office/word/2010/wordprocessingGroup" xmlns:wpi="http://schemas.microsoft.com/office/word/2010/wordprocessingInk" xmlns:wne="http://schemas.microsoft.com/office/word/2006/wordml" xmlns:wps="http://schemas.microsoft.com/office/word/2010/wordprocessingShape" mc:Ignorable="w14 w15 w16se w16cid w16 w16cex w16sdtdh w16sdtfl w16du wp14">
+<w:ftr xmlns:wpc="http://schemas.microsoft.com/office/word/2010/wordprocessingCanvas" xmlns:cx="http://schemas.microsoft.com/office/drawing/2014/chartex" xmlns:cx1="http://schemas.microsoft.com/office/drawing/2015/9/8/chartex" xmlns:cx2="http://schemas.microsoft.com/office/drawing/2015/10/21/chartex" xmlns:cx3="http://schemas.microsoft.com/office/drawing/2016/5/9/chartex" xmlns:cx4="http://schemas.microsoft.com/office/drawing/2016/5/10/chartex" xmlns:cx5="http://schemas.microsoft.com/office/drawing/2016/5/11/chartex" xmlns:cx6="http://schemas.microsoft.com/office/drawing/2016/5/12/chartex" xmlns:cx7="http://schemas.microsoft.com/office/drawing/2016/5/13/chartex" xmlns:cx8="http://schemas.microsoft.com/office/drawing/2016/5/14/chartex" xmlns:mc="http://schemas.openxmlformats.org/markup-compatibility/2006" xmlns:aink="http://schemas.microsoft.com/office/drawing/2016/ink" xmlns:am3d="http://schemas.microsoft.com/office/drawing/2017/model3d" xmlns:o="urn:schemas-microsoft-com:office:office" xmlns:oel="http://schemas.microsoft.com/office/2019/extlst" xmlns:r="http://schemas.openxmlformats.org/officeDocument/2006/relationships" xmlns:m="http://schemas.openxmlformats.org/officeDocument/2006/math" xmlns:v="urn:schemas-microsoft-com:vml" xmlns:wp14="http://schemas.microsoft.com/office/word/2010/wordprocessingDrawing" xmlns:wp="http://schemas.openxmlformats.org/drawingml/2006/wordprocessingDrawing" xmlns:w10="urn:schemas-microsoft-com:office:word" xmlns:w="http://schemas.openxmlformats.org/wordprocessingml/2006/main" xmlns:w14="http://schemas.microsoft.com/office/word/2010/wordml" xmlns:w15="http://schemas.microsoft.com/office/word/2012/wordml" xmlns:w16cex="http://schemas.microsoft.com/office/word/2018/wordml/cex" xmlns:w16cid="http://schemas.microsoft.com/office/word/2016/wordml/cid" xmlns:w16="http://schemas.microsoft.com/office/word/2018/wordml" xmlns:w16du="http://schemas.microsoft.com/office/word/2023/wordml/word16du" xmlns:w16sdtdh="http://schemas.microsoft.com/office/word/2020/wordml/sdtdatahash" xmlns:w16sdtfl="http://schemas.microsoft.com/office/word/2024/wordml/sdtformatlock" xmlns:w16se="http://schemas.microsoft.com/office/word/2015/wordml/symex" xmlns:wpg="http://schemas.microsoft.com/office/word/2010/wordprocessingGroup" xmlns:wpi="http://schemas.microsoft.com/office/word/2010/wordprocessingInk" xmlns:wne="http://schemas.microsoft.com/office/word/2006/wordml" xmlns:wps="http://schemas.microsoft.com/office/word/2010/wordprocessingShape" mc:Ignorable="w14 w15 w16se w16cid w16 w16cex w16sdtdh w16sdtfl w16du wp14">
   <w:sdt>
     <w:sdtPr>
       <w:id w:val="-386878110"/>
@@ -11437,7 +11419,6 @@
         <w:docPartUnique/>
       </w:docPartObj>
     </w:sdtPr>
-    <w:sdtEndPr/>
     <w:sdtContent>
       <w:p>
         <w:pPr>
@@ -11471,7 +11452,7 @@
 </file>
 
 <file path=word/footnotes.xml><?xml version="1.0" encoding="utf-8"?>
-<w:footnotes xmlns:wpc="http://schemas.microsoft.com/office/word/2010/wordprocessingCanvas" xmlns:cx="http://schemas.microsoft.com/office/drawing/2014/chartex" xmlns:cx1="http://schemas.microsoft.com/office/drawing/2015/9/8/chartex" xmlns:cx2="http://schemas.microsoft.com/office/drawing/2015/10/21/chartex" xmlns:cx3="http://schemas.microsoft.com/office/drawing/2016/5/9/chartex" xmlns:cx4="http://schemas.microsoft.com/office/drawing/2016/5/10/chartex" xmlns:cx5="http://schemas.microsoft.com/office/drawing/2016/5/11/chartex" xmlns:cx6="http://schemas.microsoft.com/office/drawing/2016/5/12/chartex" xmlns:cx7="http://schemas.microsoft.com/office/drawing/2016/5/13/chartex" xmlns:cx8="http://schemas.microsoft.com/office/drawing/2016/5/14/chartex" xmlns:mc="http://schemas.openxmlformats.org/markup-compatibility/2006" xmlns:aink="http://schemas.microsoft.com/office/drawing/2016/ink" xmlns:am3d="http://schemas.microsoft.com/office/drawing/2017/model3d" xmlns:o="urn:schemas-microsoft-com:office:office" xmlns:oel="http://schemas.microsoft.com/office/2019/extlst" xmlns:r="http://schemas.openxmlformats.org/officeDocument/2006/relationships" xmlns:m="http://schemas.openxmlformats.org/officeDocument/2006/math" xmlns:v="urn:schemas-microsoft-com:vml" xmlns:wp14="http://schemas.microsoft.com/office/word/2010/wordprocessingDrawing" xmlns:wp="http://schemas.openxmlformats.org/drawingml/2006/wordprocessingDrawing" xmlns:w10="urn:schemas-microsoft-com:office:word" xmlns:w="http://schemas.openxmlformats.org/wordprocessingml/2006/main" xmlns:w14="http://schemas.microsoft.com/office/word/2010/wordml" xmlns:w15="http://schemas.microsoft.com/office/word/2012/wordml" xmlns:w16cei="http://schemas.microsoft.com/office/word/2026/wordml/cei" xmlns:w16cex="http://schemas.microsoft.com/office/word/2018/wordml/cex" xmlns:w16cid="http://schemas.microsoft.com/office/word/2016/wordml/cid" xmlns:w16="http://schemas.microsoft.com/office/word/2018/wordml" xmlns:w16du="http://schemas.microsoft.com/office/word/2023/wordml/word16du" xmlns:w16sdtdh="http://schemas.microsoft.com/office/word/2020/wordml/sdtdatahash" xmlns:w16sdtfl="http://schemas.microsoft.com/office/word/2024/wordml/sdtformatlock" xmlns:w16se="http://schemas.microsoft.com/office/word/2015/wordml/symex" xmlns:wpg="http://schemas.microsoft.com/office/word/2010/wordprocessingGroup" xmlns:wpi="http://schemas.microsoft.com/office/word/2010/wordprocessingInk" xmlns:wne="http://schemas.microsoft.com/office/word/2006/wordml" xmlns:wps="http://schemas.microsoft.com/office/word/2010/wordprocessingShape" mc:Ignorable="w14 w15 w16se w16cid w16 w16cex w16sdtdh w16sdtfl w16du wp14">
+<w:footnotes xmlns:wpc="http://schemas.microsoft.com/office/word/2010/wordprocessingCanvas" xmlns:cx="http://schemas.microsoft.com/office/drawing/2014/chartex" xmlns:cx1="http://schemas.microsoft.com/office/drawing/2015/9/8/chartex" xmlns:cx2="http://schemas.microsoft.com/office/drawing/2015/10/21/chartex" xmlns:cx3="http://schemas.microsoft.com/office/drawing/2016/5/9/chartex" xmlns:cx4="http://schemas.microsoft.com/office/drawing/2016/5/10/chartex" xmlns:cx5="http://schemas.microsoft.com/office/drawing/2016/5/11/chartex" xmlns:cx6="http://schemas.microsoft.com/office/drawing/2016/5/12/chartex" xmlns:cx7="http://schemas.microsoft.com/office/drawing/2016/5/13/chartex" xmlns:cx8="http://schemas.microsoft.com/office/drawing/2016/5/14/chartex" xmlns:mc="http://schemas.openxmlformats.org/markup-compatibility/2006" xmlns:aink="http://schemas.microsoft.com/office/drawing/2016/ink" xmlns:am3d="http://schemas.microsoft.com/office/drawing/2017/model3d" xmlns:o="urn:schemas-microsoft-com:office:office" xmlns:oel="http://schemas.microsoft.com/office/2019/extlst" xmlns:r="http://schemas.openxmlformats.org/officeDocument/2006/relationships" xmlns:m="http://schemas.openxmlformats.org/officeDocument/2006/math" xmlns:v="urn:schemas-microsoft-com:vml" xmlns:wp14="http://schemas.microsoft.com/office/word/2010/wordprocessingDrawing" xmlns:wp="http://schemas.openxmlformats.org/drawingml/2006/wordprocessingDrawing" xmlns:w10="urn:schemas-microsoft-com:office:word" xmlns:w="http://schemas.openxmlformats.org/wordprocessingml/2006/main" xmlns:w14="http://schemas.microsoft.com/office/word/2010/wordml" xmlns:w15="http://schemas.microsoft.com/office/word/2012/wordml" xmlns:w16cex="http://schemas.microsoft.com/office/word/2018/wordml/cex" xmlns:w16cid="http://schemas.microsoft.com/office/word/2016/wordml/cid" xmlns:w16="http://schemas.microsoft.com/office/word/2018/wordml" xmlns:w16du="http://schemas.microsoft.com/office/word/2023/wordml/word16du" xmlns:w16sdtdh="http://schemas.microsoft.com/office/word/2020/wordml/sdtdatahash" xmlns:w16sdtfl="http://schemas.microsoft.com/office/word/2024/wordml/sdtformatlock" xmlns:w16se="http://schemas.microsoft.com/office/word/2015/wordml/symex" xmlns:wpg="http://schemas.microsoft.com/office/word/2010/wordprocessingGroup" xmlns:wpi="http://schemas.microsoft.com/office/word/2010/wordprocessingInk" xmlns:wne="http://schemas.microsoft.com/office/word/2006/wordml" xmlns:wps="http://schemas.microsoft.com/office/word/2010/wordprocessingShape" mc:Ignorable="w14 w15 w16se w16cid w16 w16cex w16sdtdh w16sdtfl w16du wp14">
   <w:footnote w:type="separator" w:id="-1">
     <w:p>
       <w:pPr>
@@ -11496,7 +11477,7 @@
 </file>
 
 <file path=word/header1.xml><?xml version="1.0" encoding="utf-8"?>
-<w:hdr xmlns:wpc="http://schemas.microsoft.com/office/word/2010/wordprocessingCanvas" xmlns:cx="http://schemas.microsoft.com/office/drawing/2014/chartex" xmlns:cx1="http://schemas.microsoft.com/office/drawing/2015/9/8/chartex" xmlns:cx2="http://schemas.microsoft.com/office/drawing/2015/10/21/chartex" xmlns:cx3="http://schemas.microsoft.com/office/drawing/2016/5/9/chartex" xmlns:cx4="http://schemas.microsoft.com/office/drawing/2016/5/10/chartex" xmlns:cx5="http://schemas.microsoft.com/office/drawing/2016/5/11/chartex" xmlns:cx6="http://schemas.microsoft.com/office/drawing/2016/5/12/chartex" xmlns:cx7="http://schemas.microsoft.com/office/drawing/2016/5/13/chartex" xmlns:cx8="http://schemas.microsoft.com/office/drawing/2016/5/14/chartex" xmlns:mc="http://schemas.openxmlformats.org/markup-compatibility/2006" xmlns:aink="http://schemas.microsoft.com/office/drawing/2016/ink" xmlns:am3d="http://schemas.microsoft.com/office/drawing/2017/model3d" xmlns:o="urn:schemas-microsoft-com:office:office" xmlns:oel="http://schemas.microsoft.com/office/2019/extlst" xmlns:r="http://schemas.openxmlformats.org/officeDocument/2006/relationships" xmlns:m="http://schemas.openxmlformats.org/officeDocument/2006/math" xmlns:v="urn:schemas-microsoft-com:vml" xmlns:wp14="http://schemas.microsoft.com/office/word/2010/wordprocessingDrawing" xmlns:wp="http://schemas.openxmlformats.org/drawingml/2006/wordprocessingDrawing" xmlns:w10="urn:schemas-microsoft-com:office:word" xmlns:w="http://schemas.openxmlformats.org/wordprocessingml/2006/main" xmlns:w14="http://schemas.microsoft.com/office/word/2010/wordml" xmlns:w15="http://schemas.microsoft.com/office/word/2012/wordml" xmlns:w16cei="http://schemas.microsoft.com/office/word/2026/wordml/cei" xmlns:w16cex="http://schemas.microsoft.com/office/word/2018/wordml/cex" xmlns:w16cid="http://schemas.microsoft.com/office/word/2016/wordml/cid" xmlns:w16="http://schemas.microsoft.com/office/word/2018/wordml" xmlns:w16du="http://schemas.microsoft.com/office/word/2023/wordml/word16du" xmlns:w16sdtdh="http://schemas.microsoft.com/office/word/2020/wordml/sdtdatahash" xmlns:w16sdtfl="http://schemas.microsoft.com/office/word/2024/wordml/sdtformatlock" xmlns:w16se="http://schemas.microsoft.com/office/word/2015/wordml/symex" xmlns:wpg="http://schemas.microsoft.com/office/word/2010/wordprocessingGroup" xmlns:wpi="http://schemas.microsoft.com/office/word/2010/wordprocessingInk" xmlns:wne="http://schemas.microsoft.com/office/word/2006/wordml" xmlns:wps="http://schemas.microsoft.com/office/word/2010/wordprocessingShape" mc:Ignorable="w14 w15 w16se w16cid w16 w16cex w16sdtdh w16sdtfl w16du wp14">
+<w:hdr xmlns:wpc="http://schemas.microsoft.com/office/word/2010/wordprocessingCanvas" xmlns:cx="http://schemas.microsoft.com/office/drawing/2014/chartex" xmlns:cx1="http://schemas.microsoft.com/office/drawing/2015/9/8/chartex" xmlns:cx2="http://schemas.microsoft.com/office/drawing/2015/10/21/chartex" xmlns:cx3="http://schemas.microsoft.com/office/drawing/2016/5/9/chartex" xmlns:cx4="http://schemas.microsoft.com/office/drawing/2016/5/10/chartex" xmlns:cx5="http://schemas.microsoft.com/office/drawing/2016/5/11/chartex" xmlns:cx6="http://schemas.microsoft.com/office/drawing/2016/5/12/chartex" xmlns:cx7="http://schemas.microsoft.com/office/drawing/2016/5/13/chartex" xmlns:cx8="http://schemas.microsoft.com/office/drawing/2016/5/14/chartex" xmlns:mc="http://schemas.openxmlformats.org/markup-compatibility/2006" xmlns:aink="http://schemas.microsoft.com/office/drawing/2016/ink" xmlns:am3d="http://schemas.microsoft.com/office/drawing/2017/model3d" xmlns:o="urn:schemas-microsoft-com:office:office" xmlns:oel="http://schemas.microsoft.com/office/2019/extlst" xmlns:r="http://schemas.openxmlformats.org/officeDocument/2006/relationships" xmlns:m="http://schemas.openxmlformats.org/officeDocument/2006/math" xmlns:v="urn:schemas-microsoft-com:vml" xmlns:wp14="http://schemas.microsoft.com/office/word/2010/wordprocessingDrawing" xmlns:wp="http://schemas.openxmlformats.org/drawingml/2006/wordprocessingDrawing" xmlns:w10="urn:schemas-microsoft-com:office:word" xmlns:w="http://schemas.openxmlformats.org/wordprocessingml/2006/main" xmlns:w14="http://schemas.microsoft.com/office/word/2010/wordml" xmlns:w15="http://schemas.microsoft.com/office/word/2012/wordml" xmlns:w16cex="http://schemas.microsoft.com/office/word/2018/wordml/cex" xmlns:w16cid="http://schemas.microsoft.com/office/word/2016/wordml/cid" xmlns:w16="http://schemas.microsoft.com/office/word/2018/wordml" xmlns:w16du="http://schemas.microsoft.com/office/word/2023/wordml/word16du" xmlns:w16sdtdh="http://schemas.microsoft.com/office/word/2020/wordml/sdtdatahash" xmlns:w16sdtfl="http://schemas.microsoft.com/office/word/2024/wordml/sdtformatlock" xmlns:w16se="http://schemas.microsoft.com/office/word/2015/wordml/symex" xmlns:wpg="http://schemas.microsoft.com/office/word/2010/wordprocessingGroup" xmlns:wpi="http://schemas.microsoft.com/office/word/2010/wordprocessingInk" xmlns:wne="http://schemas.microsoft.com/office/word/2006/wordml" xmlns:wps="http://schemas.microsoft.com/office/word/2010/wordprocessingShape" mc:Ignorable="w14 w15 w16se w16cid w16 w16cex w16sdtdh w16sdtfl w16du wp14">
   <w:p>
     <w:pPr>
       <w:pStyle w:val="Undertittel"/>
@@ -11509,7 +11490,7 @@
 </file>
 
 <file path=word/header2.xml><?xml version="1.0" encoding="utf-8"?>
-<w:hdr xmlns:wpc="http://schemas.microsoft.com/office/word/2010/wordprocessingCanvas" xmlns:cx="http://schemas.microsoft.com/office/drawing/2014/chartex" xmlns:cx1="http://schemas.microsoft.com/office/drawing/2015/9/8/chartex" xmlns:cx2="http://schemas.microsoft.com/office/drawing/2015/10/21/chartex" xmlns:cx3="http://schemas.microsoft.com/office/drawing/2016/5/9/chartex" xmlns:cx4="http://schemas.microsoft.com/office/drawing/2016/5/10/chartex" xmlns:cx5="http://schemas.microsoft.com/office/drawing/2016/5/11/chartex" xmlns:cx6="http://schemas.microsoft.com/office/drawing/2016/5/12/chartex" xmlns:cx7="http://schemas.microsoft.com/office/drawing/2016/5/13/chartex" xmlns:cx8="http://schemas.microsoft.com/office/drawing/2016/5/14/chartex" xmlns:mc="http://schemas.openxmlformats.org/markup-compatibility/2006" xmlns:aink="http://schemas.microsoft.com/office/drawing/2016/ink" xmlns:am3d="http://schemas.microsoft.com/office/drawing/2017/model3d" xmlns:o="urn:schemas-microsoft-com:office:office" xmlns:oel="http://schemas.microsoft.com/office/2019/extlst" xmlns:r="http://schemas.openxmlformats.org/officeDocument/2006/relationships" xmlns:m="http://schemas.openxmlformats.org/officeDocument/2006/math" xmlns:v="urn:schemas-microsoft-com:vml" xmlns:wp14="http://schemas.microsoft.com/office/word/2010/wordprocessingDrawing" xmlns:wp="http://schemas.openxmlformats.org/drawingml/2006/wordprocessingDrawing" xmlns:w10="urn:schemas-microsoft-com:office:word" xmlns:w="http://schemas.openxmlformats.org/wordprocessingml/2006/main" xmlns:w14="http://schemas.microsoft.com/office/word/2010/wordml" xmlns:w15="http://schemas.microsoft.com/office/word/2012/wordml" xmlns:w16cei="http://schemas.microsoft.com/office/word/2026/wordml/cei" xmlns:w16cex="http://schemas.microsoft.com/office/word/2018/wordml/cex" xmlns:w16cid="http://schemas.microsoft.com/office/word/2016/wordml/cid" xmlns:w16="http://schemas.microsoft.com/office/word/2018/wordml" xmlns:w16du="http://schemas.microsoft.com/office/word/2023/wordml/word16du" xmlns:w16sdtdh="http://schemas.microsoft.com/office/word/2020/wordml/sdtdatahash" xmlns:w16sdtfl="http://schemas.microsoft.com/office/word/2024/wordml/sdtformatlock" xmlns:w16se="http://schemas.microsoft.com/office/word/2015/wordml/symex" xmlns:wpg="http://schemas.microsoft.com/office/word/2010/wordprocessingGroup" xmlns:wpi="http://schemas.microsoft.com/office/word/2010/wordprocessingInk" xmlns:wne="http://schemas.microsoft.com/office/word/2006/wordml" xmlns:wps="http://schemas.microsoft.com/office/word/2010/wordprocessingShape" mc:Ignorable="w14 w15 w16se w16cid w16 w16cex w16sdtdh w16sdtfl w16du wp14">
+<w:hdr xmlns:wpc="http://schemas.microsoft.com/office/word/2010/wordprocessingCanvas" xmlns:cx="http://schemas.microsoft.com/office/drawing/2014/chartex" xmlns:cx1="http://schemas.microsoft.com/office/drawing/2015/9/8/chartex" xmlns:cx2="http://schemas.microsoft.com/office/drawing/2015/10/21/chartex" xmlns:cx3="http://schemas.microsoft.com/office/drawing/2016/5/9/chartex" xmlns:cx4="http://schemas.microsoft.com/office/drawing/2016/5/10/chartex" xmlns:cx5="http://schemas.microsoft.com/office/drawing/2016/5/11/chartex" xmlns:cx6="http://schemas.microsoft.com/office/drawing/2016/5/12/chartex" xmlns:cx7="http://schemas.microsoft.com/office/drawing/2016/5/13/chartex" xmlns:cx8="http://schemas.microsoft.com/office/drawing/2016/5/14/chartex" xmlns:mc="http://schemas.openxmlformats.org/markup-compatibility/2006" xmlns:aink="http://schemas.microsoft.com/office/drawing/2016/ink" xmlns:am3d="http://schemas.microsoft.com/office/drawing/2017/model3d" xmlns:o="urn:schemas-microsoft-com:office:office" xmlns:oel="http://schemas.microsoft.com/office/2019/extlst" xmlns:r="http://schemas.openxmlformats.org/officeDocument/2006/relationships" xmlns:m="http://schemas.openxmlformats.org/officeDocument/2006/math" xmlns:v="urn:schemas-microsoft-com:vml" xmlns:wp14="http://schemas.microsoft.com/office/word/2010/wordprocessingDrawing" xmlns:wp="http://schemas.openxmlformats.org/drawingml/2006/wordprocessingDrawing" xmlns:w10="urn:schemas-microsoft-com:office:word" xmlns:w="http://schemas.openxmlformats.org/wordprocessingml/2006/main" xmlns:w14="http://schemas.microsoft.com/office/word/2010/wordml" xmlns:w15="http://schemas.microsoft.com/office/word/2012/wordml" xmlns:w16cex="http://schemas.microsoft.com/office/word/2018/wordml/cex" xmlns:w16cid="http://schemas.microsoft.com/office/word/2016/wordml/cid" xmlns:w16="http://schemas.microsoft.com/office/word/2018/wordml" xmlns:w16du="http://schemas.microsoft.com/office/word/2023/wordml/word16du" xmlns:w16sdtdh="http://schemas.microsoft.com/office/word/2020/wordml/sdtdatahash" xmlns:w16sdtfl="http://schemas.microsoft.com/office/word/2024/wordml/sdtformatlock" xmlns:w16se="http://schemas.microsoft.com/office/word/2015/wordml/symex" xmlns:wpg="http://schemas.microsoft.com/office/word/2010/wordprocessingGroup" xmlns:wpi="http://schemas.microsoft.com/office/word/2010/wordprocessingInk" xmlns:wne="http://schemas.microsoft.com/office/word/2006/wordml" xmlns:wps="http://schemas.microsoft.com/office/word/2010/wordprocessingShape" mc:Ignorable="w14 w15 w16se w16cid w16 w16cex w16sdtdh w16sdtfl w16du wp14">
   <w:p>
     <w:pPr>
       <w:pStyle w:val="Undertittel"/>
@@ -11522,7 +11503,7 @@
 </file>
 
 <file path=word/numbering.xml><?xml version="1.0" encoding="utf-8"?>
-<w:numbering xmlns:wpc="http://schemas.microsoft.com/office/word/2010/wordprocessingCanvas" xmlns:cx="http://schemas.microsoft.com/office/drawing/2014/chartex" xmlns:cx1="http://schemas.microsoft.com/office/drawing/2015/9/8/chartex" xmlns:cx2="http://schemas.microsoft.com/office/drawing/2015/10/21/chartex" xmlns:cx3="http://schemas.microsoft.com/office/drawing/2016/5/9/chartex" xmlns:cx4="http://schemas.microsoft.com/office/drawing/2016/5/10/chartex" xmlns:cx5="http://schemas.microsoft.com/office/drawing/2016/5/11/chartex" xmlns:cx6="http://schemas.microsoft.com/office/drawing/2016/5/12/chartex" xmlns:cx7="http://schemas.microsoft.com/office/drawing/2016/5/13/chartex" xmlns:cx8="http://schemas.microsoft.com/office/drawing/2016/5/14/chartex" xmlns:mc="http://schemas.openxmlformats.org/markup-compatibility/2006" xmlns:aink="http://schemas.microsoft.com/office/drawing/2016/ink" xmlns:am3d="http://schemas.microsoft.com/office/drawing/2017/model3d" xmlns:o="urn:schemas-microsoft-com:office:office" xmlns:oel="http://schemas.microsoft.com/office/2019/extlst" xmlns:r="http://schemas.openxmlformats.org/officeDocument/2006/relationships" xmlns:m="http://schemas.openxmlformats.org/officeDocument/2006/math" xmlns:v="urn:schemas-microsoft-com:vml" xmlns:wp14="http://schemas.microsoft.com/office/word/2010/wordprocessingDrawing" xmlns:wp="http://schemas.openxmlformats.org/drawingml/2006/wordprocessingDrawing" xmlns:w10="urn:schemas-microsoft-com:office:word" xmlns:w="http://schemas.openxmlformats.org/wordprocessingml/2006/main" xmlns:w14="http://schemas.microsoft.com/office/word/2010/wordml" xmlns:w15="http://schemas.microsoft.com/office/word/2012/wordml" xmlns:w16cei="http://schemas.microsoft.com/office/word/2026/wordml/cei" xmlns:w16cex="http://schemas.microsoft.com/office/word/2018/wordml/cex" xmlns:w16cid="http://schemas.microsoft.com/office/word/2016/wordml/cid" xmlns:w16="http://schemas.microsoft.com/office/word/2018/wordml" xmlns:w16du="http://schemas.microsoft.com/office/word/2023/wordml/word16du" xmlns:w16sdtdh="http://schemas.microsoft.com/office/word/2020/wordml/sdtdatahash" xmlns:w16sdtfl="http://schemas.microsoft.com/office/word/2024/wordml/sdtformatlock" xmlns:w16se="http://schemas.microsoft.com/office/word/2015/wordml/symex" xmlns:wpg="http://schemas.microsoft.com/office/word/2010/wordprocessingGroup" xmlns:wpi="http://schemas.microsoft.com/office/word/2010/wordprocessingInk" xmlns:wne="http://schemas.microsoft.com/office/word/2006/wordml" xmlns:wps="http://schemas.microsoft.com/office/word/2010/wordprocessingShape" mc:Ignorable="w14 w15 w16se w16cid w16 w16cex w16sdtdh w16sdtfl w16du wp14">
+<w:numbering xmlns:wpc="http://schemas.microsoft.com/office/word/2010/wordprocessingCanvas" xmlns:cx="http://schemas.microsoft.com/office/drawing/2014/chartex" xmlns:cx1="http://schemas.microsoft.com/office/drawing/2015/9/8/chartex" xmlns:cx2="http://schemas.microsoft.com/office/drawing/2015/10/21/chartex" xmlns:cx3="http://schemas.microsoft.com/office/drawing/2016/5/9/chartex" xmlns:cx4="http://schemas.microsoft.com/office/drawing/2016/5/10/chartex" xmlns:cx5="http://schemas.microsoft.com/office/drawing/2016/5/11/chartex" xmlns:cx6="http://schemas.microsoft.com/office/drawing/2016/5/12/chartex" xmlns:cx7="http://schemas.microsoft.com/office/drawing/2016/5/13/chartex" xmlns:cx8="http://schemas.microsoft.com/office/drawing/2016/5/14/chartex" xmlns:mc="http://schemas.openxmlformats.org/markup-compatibility/2006" xmlns:aink="http://schemas.microsoft.com/office/drawing/2016/ink" xmlns:am3d="http://schemas.microsoft.com/office/drawing/2017/model3d" xmlns:o="urn:schemas-microsoft-com:office:office" xmlns:oel="http://schemas.microsoft.com/office/2019/extlst" xmlns:r="http://schemas.openxmlformats.org/officeDocument/2006/relationships" xmlns:m="http://schemas.openxmlformats.org/officeDocument/2006/math" xmlns:v="urn:schemas-microsoft-com:vml" xmlns:wp14="http://schemas.microsoft.com/office/word/2010/wordprocessingDrawing" xmlns:wp="http://schemas.openxmlformats.org/drawingml/2006/wordprocessingDrawing" xmlns:w10="urn:schemas-microsoft-com:office:word" xmlns:w="http://schemas.openxmlformats.org/wordprocessingml/2006/main" xmlns:w14="http://schemas.microsoft.com/office/word/2010/wordml" xmlns:w15="http://schemas.microsoft.com/office/word/2012/wordml" xmlns:w16cex="http://schemas.microsoft.com/office/word/2018/wordml/cex" xmlns:w16cid="http://schemas.microsoft.com/office/word/2016/wordml/cid" xmlns:w16="http://schemas.microsoft.com/office/word/2018/wordml" xmlns:w16du="http://schemas.microsoft.com/office/word/2023/wordml/word16du" xmlns:w16sdtdh="http://schemas.microsoft.com/office/word/2020/wordml/sdtdatahash" xmlns:w16sdtfl="http://schemas.microsoft.com/office/word/2024/wordml/sdtformatlock" xmlns:w16se="http://schemas.microsoft.com/office/word/2015/wordml/symex" xmlns:wpg="http://schemas.microsoft.com/office/word/2010/wordprocessingGroup" xmlns:wpi="http://schemas.microsoft.com/office/word/2010/wordprocessingInk" xmlns:wne="http://schemas.microsoft.com/office/word/2006/wordml" xmlns:wps="http://schemas.microsoft.com/office/word/2010/wordprocessingShape" mc:Ignorable="w14 w15 w16se w16cid w16 w16cex w16sdtdh w16sdtfl w16du wp14">
   <w:abstractNum w:abstractNumId="0" w15:restartNumberingAfterBreak="0">
     <w:nsid w:val="03852EF1"/>
     <w:multiLevelType w:val="hybridMultilevel"/>
@@ -15673,6 +15654,18 @@
 </file>
 
 <file path=customXml/item2.xml><?xml version="1.0" encoding="utf-8"?>
+<b:Sources xmlns:b="http://schemas.openxmlformats.org/officeDocument/2006/bibliography" xmlns="http://schemas.openxmlformats.org/officeDocument/2006/bibliography" SelectedStyle="\APASixthEditionOfficeOnline.xsl" StyleName="APA" Version="6"/>
+</file>
+
+<file path=customXml/item3.xml><?xml version="1.0" encoding="utf-8"?>
+<p:properties xmlns:p="http://schemas.microsoft.com/office/2006/metadata/properties" xmlns:xsi="http://www.w3.org/2001/XMLSchema-instance" xmlns:pc="http://schemas.microsoft.com/office/infopath/2007/PartnerControls">
+  <documentManagement>
+    <Kortbeskrivelse xmlns="17820eb2-e900-4c69-9281-707a51dd939a" xsi:nil="true"/>
+  </documentManagement>
+</p:properties>
+</file>
+
+<file path=customXml/item4.xml><?xml version="1.0" encoding="utf-8"?>
 <ct:contentTypeSchema xmlns:ct="http://schemas.microsoft.com/office/2006/metadata/contentType" xmlns:ma="http://schemas.microsoft.com/office/2006/metadata/properties/metaAttributes" ct:_="" ma:_="" ma:contentTypeName="Dokument" ma:contentTypeID="0x01010036916457F6DCE74EB55FF474EA2F3FD3" ma:contentTypeVersion="5" ma:contentTypeDescription="Opprett et nytt dokument." ma:contentTypeScope="" ma:versionID="e590dc1b09dbcff83d06c0235457f097">
   <xsd:schema xmlns:xsd="http://www.w3.org/2001/XMLSchema" xmlns:xs="http://www.w3.org/2001/XMLSchema" xmlns:p="http://schemas.microsoft.com/office/2006/metadata/properties" xmlns:ns2="17820eb2-e900-4c69-9281-707a51dd939a" targetNamespace="http://schemas.microsoft.com/office/2006/metadata/properties" ma:root="true" ma:fieldsID="9786b617f93919eacb7b572548e019ef" ns2:_="">
     <xsd:import namespace="17820eb2-e900-4c69-9281-707a51dd939a"/>
@@ -15824,18 +15817,6 @@
 </ct:contentTypeSchema>
 </file>
 
-<file path=customXml/item3.xml><?xml version="1.0" encoding="utf-8"?>
-<p:properties xmlns:p="http://schemas.microsoft.com/office/2006/metadata/properties" xmlns:xsi="http://www.w3.org/2001/XMLSchema-instance" xmlns:pc="http://schemas.microsoft.com/office/infopath/2007/PartnerControls">
-  <documentManagement>
-    <Kortbeskrivelse xmlns="17820eb2-e900-4c69-9281-707a51dd939a" xsi:nil="true"/>
-  </documentManagement>
-</p:properties>
-</file>
-
-<file path=customXml/item4.xml><?xml version="1.0" encoding="utf-8"?>
-<b:Sources xmlns:b="http://schemas.openxmlformats.org/officeDocument/2006/bibliography" xmlns="http://schemas.openxmlformats.org/officeDocument/2006/bibliography" SelectedStyle="\APASixthEditionOfficeOnline.xsl" StyleName="APA" Version="6"/>
-</file>
-
 <file path=customXml/itemProps1.xml><?xml version="1.0" encoding="utf-8"?>
 <ds:datastoreItem xmlns:ds="http://schemas.openxmlformats.org/officeDocument/2006/customXml" ds:itemID="{4AEBD858-B2B4-4E57-B807-F2680FEBFAA6}">
   <ds:schemaRefs>
@@ -15845,6 +15826,24 @@
 </file>
 
 <file path=customXml/itemProps2.xml><?xml version="1.0" encoding="utf-8"?>
+<ds:datastoreItem xmlns:ds="http://schemas.openxmlformats.org/officeDocument/2006/customXml" ds:itemID="{47E2D707-BCE2-472C-A8E2-5C87A2D55B19}">
+  <ds:schemaRefs>
+    <ds:schemaRef ds:uri="http://schemas.openxmlformats.org/officeDocument/2006/bibliography"/>
+  </ds:schemaRefs>
+</ds:datastoreItem>
+</file>
+
+<file path=customXml/itemProps3.xml><?xml version="1.0" encoding="utf-8"?>
+<ds:datastoreItem xmlns:ds="http://schemas.openxmlformats.org/officeDocument/2006/customXml" ds:itemID="{50EA2067-A623-41E0-BF03-3E8B46F1A03D}">
+  <ds:schemaRefs>
+    <ds:schemaRef ds:uri="http://schemas.microsoft.com/office/2006/metadata/properties"/>
+    <ds:schemaRef ds:uri="http://schemas.microsoft.com/office/infopath/2007/PartnerControls"/>
+    <ds:schemaRef ds:uri="17820eb2-e900-4c69-9281-707a51dd939a"/>
+  </ds:schemaRefs>
+</ds:datastoreItem>
+</file>
+
+<file path=customXml/itemProps4.xml><?xml version="1.0" encoding="utf-8"?>
 <ds:datastoreItem xmlns:ds="http://schemas.openxmlformats.org/officeDocument/2006/customXml" ds:itemID="{F8207D99-D5C0-474F-A208-2F1ABDF114DE}">
   <ds:schemaRefs>
     <ds:schemaRef ds:uri="http://schemas.microsoft.com/office/2006/metadata/contentType"/>
@@ -15860,22 +15859,4 @@
     <ds:schemaRef ds:uri="http://schemas.microsoft.com/internal/obd"/>
   </ds:schemaRefs>
 </ds:datastoreItem>
-</file>
-
-<file path=customXml/itemProps3.xml><?xml version="1.0" encoding="utf-8"?>
-<ds:datastoreItem xmlns:ds="http://schemas.openxmlformats.org/officeDocument/2006/customXml" ds:itemID="{50EA2067-A623-41E0-BF03-3E8B46F1A03D}">
-  <ds:schemaRefs>
-    <ds:schemaRef ds:uri="http://schemas.microsoft.com/office/2006/metadata/properties"/>
-    <ds:schemaRef ds:uri="http://schemas.microsoft.com/office/infopath/2007/PartnerControls"/>
-    <ds:schemaRef ds:uri="17820eb2-e900-4c69-9281-707a51dd939a"/>
-  </ds:schemaRefs>
-</ds:datastoreItem>
-</file>
-
-<file path=customXml/itemProps4.xml><?xml version="1.0" encoding="utf-8"?>
-<ds:datastoreItem xmlns:ds="http://schemas.openxmlformats.org/officeDocument/2006/customXml" ds:itemID="{47E2D707-BCE2-472C-A8E2-5C87A2D55B19}">
-  <ds:schemaRefs>
-    <ds:schemaRef ds:uri="http://schemas.openxmlformats.org/officeDocument/2006/bibliography"/>
-  </ds:schemaRefs>
-</ds:datastoreItem>
 </file>
</xml_diff>

<commit_message>
Tester ut link til løsningsforslag
</commit_message>
<xml_diff>
--- a/arbeidshefter_r1_word/1_algebra_potenser_og_rotter.docx
+++ b/arbeidshefter_r1_word/1_algebra_potenser_og_rotter.docx
@@ -2672,6 +2672,68 @@
           </m:sup>
         </m:sSup>
       </m:oMath>
+    </w:p>
+    <w:p>
+      <w:pPr>
+        <w:pStyle w:val="Brdtekst"/>
+        <w:ind w:left="360"/>
+        <w:rPr>
+          <w:sz w:val="22"/>
+        </w:rPr>
+      </w:pPr>
+      <w:hyperlink r:id="rId15" w:history="1">
+        <w:r>
+          <w:rPr>
+            <w:rStyle w:val="Hyperkobling"/>
+            <w:sz w:val="22"/>
+          </w:rPr>
+          <w:t>Løsninge</w:t>
+        </w:r>
+        <w:r>
+          <w:rPr>
+            <w:rStyle w:val="Hyperkobling"/>
+            <w:sz w:val="22"/>
+          </w:rPr>
+          <w:t>r</w:t>
+        </w:r>
+        <w:r>
+          <w:rPr>
+            <w:rStyle w:val="Hyperkobling"/>
+            <w:sz w:val="22"/>
+          </w:rPr>
+          <w:t xml:space="preserve"> (</w:t>
+        </w:r>
+        <w:proofErr w:type="gramStart"/>
+        <w:r>
+          <w:rPr>
+            <w:rStyle w:val="Hyperkobling"/>
+            <w:sz w:val="22"/>
+          </w:rPr>
+          <w:t>li</w:t>
+        </w:r>
+        <w:r>
+          <w:rPr>
+            <w:rStyle w:val="Hyperkobling"/>
+            <w:sz w:val="22"/>
+          </w:rPr>
+          <w:t>n</w:t>
+        </w:r>
+        <w:r>
+          <w:rPr>
+            <w:rStyle w:val="Hyperkobling"/>
+            <w:sz w:val="22"/>
+          </w:rPr>
+          <w:t>k</w:t>
+        </w:r>
+        <w:proofErr w:type="gramEnd"/>
+        <w:r>
+          <w:rPr>
+            <w:rStyle w:val="Hyperkobling"/>
+            <w:sz w:val="22"/>
+          </w:rPr>
+          <w:t>)</w:t>
+        </w:r>
+      </w:hyperlink>
     </w:p>
     <w:p>
       <w:pPr>
@@ -3523,7 +3585,23 @@
           <w:sz w:val="24"/>
           <w:szCs w:val="24"/>
         </w:rPr>
-        <w:t xml:space="preserve">Regn ut, og sorter tallene i stigende rekkefølge fra minste verdi til største verdi. </w:t>
+        <w:t xml:space="preserve">Regn ut, og sorter tallene i stigende rekkefølge fra minste verdi til </w:t>
+      </w:r>
+      <w:proofErr w:type="spellStart"/>
+      <w:r>
+        <w:rPr>
+          <w:sz w:val="24"/>
+          <w:szCs w:val="24"/>
+        </w:rPr>
+        <w:t>største</w:t>
+      </w:r>
+      <w:proofErr w:type="spellEnd"/>
+      <w:r>
+        <w:rPr>
+          <w:sz w:val="24"/>
+          <w:szCs w:val="24"/>
+        </w:rPr>
+        <w:t xml:space="preserve"> verdi. </w:t>
       </w:r>
     </w:p>
     <w:p>
@@ -4560,6 +4638,7 @@
         </w:rPr>
         <w:t xml:space="preserve">Trekk ut så mye som mulig fra </w:t>
       </w:r>
+      <w:proofErr w:type="spellStart"/>
       <w:proofErr w:type="gramStart"/>
       <w:r>
         <w:rPr>
@@ -4567,7 +4646,16 @@
           <w:sz w:val="24"/>
           <w:szCs w:val="24"/>
         </w:rPr>
-        <w:t>rotuttrykket  (</w:t>
+        <w:t>rotuttrykket</w:t>
+      </w:r>
+      <w:proofErr w:type="spellEnd"/>
+      <w:r>
+        <w:rPr>
+          <w:rFonts w:eastAsiaTheme="minorEastAsia"/>
+          <w:sz w:val="24"/>
+          <w:szCs w:val="24"/>
+        </w:rPr>
+        <w:t xml:space="preserve">  (</w:t>
       </w:r>
       <w:proofErr w:type="gramEnd"/>
       <w:r>
@@ -6959,7 +7047,7 @@
                     <pic:cNvPicPr/>
                   </pic:nvPicPr>
                   <pic:blipFill>
-                    <a:blip r:embed="rId15"/>
+                    <a:blip r:embed="rId16"/>
                     <a:stretch>
                       <a:fillRect/>
                     </a:stretch>
@@ -7029,7 +7117,7 @@
                     <pic:cNvPicPr/>
                   </pic:nvPicPr>
                   <pic:blipFill>
-                    <a:blip r:embed="rId16"/>
+                    <a:blip r:embed="rId17"/>
                     <a:stretch>
                       <a:fillRect/>
                     </a:stretch>
@@ -7106,7 +7194,7 @@
                     <pic:cNvPicPr/>
                   </pic:nvPicPr>
                   <pic:blipFill>
-                    <a:blip r:embed="rId17"/>
+                    <a:blip r:embed="rId18"/>
                     <a:stretch>
                       <a:fillRect/>
                     </a:stretch>
@@ -7176,7 +7264,7 @@
                     <pic:cNvPicPr/>
                   </pic:nvPicPr>
                   <pic:blipFill>
-                    <a:blip r:embed="rId18"/>
+                    <a:blip r:embed="rId19"/>
                     <a:stretch>
                       <a:fillRect/>
                     </a:stretch>
@@ -7244,7 +7332,7 @@
                     <pic:cNvPicPr/>
                   </pic:nvPicPr>
                   <pic:blipFill>
-                    <a:blip r:embed="rId19"/>
+                    <a:blip r:embed="rId20"/>
                     <a:stretch>
                       <a:fillRect/>
                     </a:stretch>
@@ -7332,7 +7420,7 @@
                     <pic:cNvPicPr/>
                   </pic:nvPicPr>
                   <pic:blipFill>
-                    <a:blip r:embed="rId20"/>
+                    <a:blip r:embed="rId21"/>
                     <a:stretch>
                       <a:fillRect/>
                     </a:stretch>
@@ -7402,7 +7490,7 @@
                     <pic:cNvPicPr/>
                   </pic:nvPicPr>
                   <pic:blipFill>
-                    <a:blip r:embed="rId21"/>
+                    <a:blip r:embed="rId22"/>
                     <a:stretch>
                       <a:fillRect/>
                     </a:stretch>
@@ -7470,7 +7558,7 @@
                     <pic:cNvPicPr/>
                   </pic:nvPicPr>
                   <pic:blipFill>
-                    <a:blip r:embed="rId22"/>
+                    <a:blip r:embed="rId23"/>
                     <a:stretch>
                       <a:fillRect/>
                     </a:stretch>
@@ -7533,7 +7621,7 @@
                     <pic:cNvPicPr/>
                   </pic:nvPicPr>
                   <pic:blipFill>
-                    <a:blip r:embed="rId23"/>
+                    <a:blip r:embed="rId24"/>
                     <a:stretch>
                       <a:fillRect/>
                     </a:stretch>
@@ -7601,7 +7689,7 @@
                     <pic:cNvPicPr/>
                   </pic:nvPicPr>
                   <pic:blipFill>
-                    <a:blip r:embed="rId24"/>
+                    <a:blip r:embed="rId25"/>
                     <a:stretch>
                       <a:fillRect/>
                     </a:stretch>
@@ -7666,7 +7754,7 @@
                     <pic:cNvPicPr/>
                   </pic:nvPicPr>
                   <pic:blipFill>
-                    <a:blip r:embed="rId25"/>
+                    <a:blip r:embed="rId26"/>
                     <a:stretch>
                       <a:fillRect/>
                     </a:stretch>
@@ -7734,7 +7822,7 @@
                     <pic:cNvPicPr/>
                   </pic:nvPicPr>
                   <pic:blipFill>
-                    <a:blip r:embed="rId26"/>
+                    <a:blip r:embed="rId27"/>
                     <a:stretch>
                       <a:fillRect/>
                     </a:stretch>
@@ -7788,7 +7876,7 @@
                     <pic:cNvPicPr/>
                   </pic:nvPicPr>
                   <pic:blipFill>
-                    <a:blip r:embed="rId27"/>
+                    <a:blip r:embed="rId28"/>
                     <a:stretch>
                       <a:fillRect/>
                     </a:stretch>
@@ -7856,7 +7944,7 @@
                     <pic:cNvPicPr/>
                   </pic:nvPicPr>
                   <pic:blipFill>
-                    <a:blip r:embed="rId28"/>
+                    <a:blip r:embed="rId29"/>
                     <a:stretch>
                       <a:fillRect/>
                     </a:stretch>
@@ -7925,7 +8013,7 @@
                     <pic:cNvPicPr/>
                   </pic:nvPicPr>
                   <pic:blipFill>
-                    <a:blip r:embed="rId29"/>
+                    <a:blip r:embed="rId30"/>
                     <a:stretch>
                       <a:fillRect/>
                     </a:stretch>
@@ -7979,7 +8067,7 @@
                     <pic:cNvPicPr/>
                   </pic:nvPicPr>
                   <pic:blipFill>
-                    <a:blip r:embed="rId30"/>
+                    <a:blip r:embed="rId31"/>
                     <a:stretch>
                       <a:fillRect/>
                     </a:stretch>
@@ -8043,7 +8131,7 @@
                     <pic:cNvPicPr/>
                   </pic:nvPicPr>
                   <pic:blipFill>
-                    <a:blip r:embed="rId31"/>
+                    <a:blip r:embed="rId32"/>
                     <a:stretch>
                       <a:fillRect/>
                     </a:stretch>
@@ -8107,7 +8195,7 @@
                     <pic:cNvPicPr/>
                   </pic:nvPicPr>
                   <pic:blipFill>
-                    <a:blip r:embed="rId32"/>
+                    <a:blip r:embed="rId33"/>
                     <a:stretch>
                       <a:fillRect/>
                     </a:stretch>
@@ -9965,15 +10053,7 @@
             <w:sz w:val="24"/>
             <w:szCs w:val="24"/>
           </w:rPr>
-          <m:t>5</m:t>
-        </m:r>
-        <m:r>
-          <w:rPr>
-            <w:rFonts w:ascii="Cambria Math" w:hAnsi="Cambria Math"/>
-            <w:sz w:val="24"/>
-            <w:szCs w:val="24"/>
-          </w:rPr>
-          <m:t> </m:t>
+          <m:t>5 </m:t>
         </m:r>
       </m:oMath>
     </w:p>
@@ -15346,6 +15426,30 @@
       </w:tblBorders>
     </w:tblPr>
   </w:style>
+  <w:style w:type="character" w:styleId="Ulstomtale">
+    <w:name w:val="Unresolved Mention"/>
+    <w:basedOn w:val="Standardskriftforavsnitt"/>
+    <w:uiPriority w:val="99"/>
+    <w:semiHidden/>
+    <w:unhideWhenUsed/>
+    <w:rsid w:val="00D26EAA"/>
+    <w:rPr>
+      <w:color w:val="605E5C"/>
+      <w:shd w:val="clear" w:color="auto" w:fill="E1DFDD"/>
+    </w:rPr>
+  </w:style>
+  <w:style w:type="character" w:styleId="Fulgthyperkobling">
+    <w:name w:val="FollowedHyperlink"/>
+    <w:basedOn w:val="Standardskriftforavsnitt"/>
+    <w:uiPriority w:val="99"/>
+    <w:semiHidden/>
+    <w:unhideWhenUsed/>
+    <w:rsid w:val="00D26EAA"/>
+    <w:rPr>
+      <w:color w:val="96607D" w:themeColor="followedHyperlink"/>
+      <w:u w:val="single"/>
+    </w:rPr>
+  </w:style>
 </w:styles>
 </file>
 
@@ -15654,18 +15758,6 @@
 </file>
 
 <file path=customXml/item2.xml><?xml version="1.0" encoding="utf-8"?>
-<b:Sources xmlns:b="http://schemas.openxmlformats.org/officeDocument/2006/bibliography" xmlns="http://schemas.openxmlformats.org/officeDocument/2006/bibliography" SelectedStyle="\APASixthEditionOfficeOnline.xsl" StyleName="APA" Version="6"/>
-</file>
-
-<file path=customXml/item3.xml><?xml version="1.0" encoding="utf-8"?>
-<p:properties xmlns:p="http://schemas.microsoft.com/office/2006/metadata/properties" xmlns:xsi="http://www.w3.org/2001/XMLSchema-instance" xmlns:pc="http://schemas.microsoft.com/office/infopath/2007/PartnerControls">
-  <documentManagement>
-    <Kortbeskrivelse xmlns="17820eb2-e900-4c69-9281-707a51dd939a" xsi:nil="true"/>
-  </documentManagement>
-</p:properties>
-</file>
-
-<file path=customXml/item4.xml><?xml version="1.0" encoding="utf-8"?>
 <ct:contentTypeSchema xmlns:ct="http://schemas.microsoft.com/office/2006/metadata/contentType" xmlns:ma="http://schemas.microsoft.com/office/2006/metadata/properties/metaAttributes" ct:_="" ma:_="" ma:contentTypeName="Dokument" ma:contentTypeID="0x01010036916457F6DCE74EB55FF474EA2F3FD3" ma:contentTypeVersion="5" ma:contentTypeDescription="Opprett et nytt dokument." ma:contentTypeScope="" ma:versionID="e590dc1b09dbcff83d06c0235457f097">
   <xsd:schema xmlns:xsd="http://www.w3.org/2001/XMLSchema" xmlns:xs="http://www.w3.org/2001/XMLSchema" xmlns:p="http://schemas.microsoft.com/office/2006/metadata/properties" xmlns:ns2="17820eb2-e900-4c69-9281-707a51dd939a" targetNamespace="http://schemas.microsoft.com/office/2006/metadata/properties" ma:root="true" ma:fieldsID="9786b617f93919eacb7b572548e019ef" ns2:_="">
     <xsd:import namespace="17820eb2-e900-4c69-9281-707a51dd939a"/>
@@ -15817,6 +15909,18 @@
 </ct:contentTypeSchema>
 </file>
 
+<file path=customXml/item3.xml><?xml version="1.0" encoding="utf-8"?>
+<p:properties xmlns:p="http://schemas.microsoft.com/office/2006/metadata/properties" xmlns:xsi="http://www.w3.org/2001/XMLSchema-instance" xmlns:pc="http://schemas.microsoft.com/office/infopath/2007/PartnerControls">
+  <documentManagement>
+    <Kortbeskrivelse xmlns="17820eb2-e900-4c69-9281-707a51dd939a" xsi:nil="true"/>
+  </documentManagement>
+</p:properties>
+</file>
+
+<file path=customXml/item4.xml><?xml version="1.0" encoding="utf-8"?>
+<b:Sources xmlns:b="http://schemas.openxmlformats.org/officeDocument/2006/bibliography" xmlns="http://schemas.openxmlformats.org/officeDocument/2006/bibliography" SelectedStyle="\APASixthEditionOfficeOnline.xsl" StyleName="APA" Version="6"/>
+</file>
+
 <file path=customXml/itemProps1.xml><?xml version="1.0" encoding="utf-8"?>
 <ds:datastoreItem xmlns:ds="http://schemas.openxmlformats.org/officeDocument/2006/customXml" ds:itemID="{4AEBD858-B2B4-4E57-B807-F2680FEBFAA6}">
   <ds:schemaRefs>
@@ -15826,9 +15930,19 @@
 </file>
 
 <file path=customXml/itemProps2.xml><?xml version="1.0" encoding="utf-8"?>
-<ds:datastoreItem xmlns:ds="http://schemas.openxmlformats.org/officeDocument/2006/customXml" ds:itemID="{47E2D707-BCE2-472C-A8E2-5C87A2D55B19}">
+<ds:datastoreItem xmlns:ds="http://schemas.openxmlformats.org/officeDocument/2006/customXml" ds:itemID="{F8207D99-D5C0-474F-A208-2F1ABDF114DE}">
   <ds:schemaRefs>
-    <ds:schemaRef ds:uri="http://schemas.openxmlformats.org/officeDocument/2006/bibliography"/>
+    <ds:schemaRef ds:uri="http://schemas.microsoft.com/office/2006/metadata/contentType"/>
+    <ds:schemaRef ds:uri="http://schemas.microsoft.com/office/2006/metadata/properties/metaAttributes"/>
+    <ds:schemaRef ds:uri="http://www.w3.org/2001/XMLSchema"/>
+    <ds:schemaRef ds:uri="http://schemas.microsoft.com/office/2006/metadata/properties"/>
+    <ds:schemaRef ds:uri="17820eb2-e900-4c69-9281-707a51dd939a"/>
+    <ds:schemaRef ds:uri="http://schemas.microsoft.com/office/2006/documentManagement/types"/>
+    <ds:schemaRef ds:uri="http://schemas.microsoft.com/office/infopath/2007/PartnerControls"/>
+    <ds:schemaRef ds:uri="http://schemas.openxmlformats.org/package/2006/metadata/core-properties"/>
+    <ds:schemaRef ds:uri="http://purl.org/dc/elements/1.1/"/>
+    <ds:schemaRef ds:uri="http://purl.org/dc/terms/"/>
+    <ds:schemaRef ds:uri="http://schemas.microsoft.com/internal/obd"/>
   </ds:schemaRefs>
 </ds:datastoreItem>
 </file>
@@ -15844,19 +15958,9 @@
 </file>
 
 <file path=customXml/itemProps4.xml><?xml version="1.0" encoding="utf-8"?>
-<ds:datastoreItem xmlns:ds="http://schemas.openxmlformats.org/officeDocument/2006/customXml" ds:itemID="{F8207D99-D5C0-474F-A208-2F1ABDF114DE}">
+<ds:datastoreItem xmlns:ds="http://schemas.openxmlformats.org/officeDocument/2006/customXml" ds:itemID="{47E2D707-BCE2-472C-A8E2-5C87A2D55B19}">
   <ds:schemaRefs>
-    <ds:schemaRef ds:uri="http://schemas.microsoft.com/office/2006/metadata/contentType"/>
-    <ds:schemaRef ds:uri="http://schemas.microsoft.com/office/2006/metadata/properties/metaAttributes"/>
-    <ds:schemaRef ds:uri="http://www.w3.org/2001/XMLSchema"/>
-    <ds:schemaRef ds:uri="http://schemas.microsoft.com/office/2006/metadata/properties"/>
-    <ds:schemaRef ds:uri="17820eb2-e900-4c69-9281-707a51dd939a"/>
-    <ds:schemaRef ds:uri="http://schemas.microsoft.com/office/2006/documentManagement/types"/>
-    <ds:schemaRef ds:uri="http://schemas.microsoft.com/office/infopath/2007/PartnerControls"/>
-    <ds:schemaRef ds:uri="http://schemas.openxmlformats.org/package/2006/metadata/core-properties"/>
-    <ds:schemaRef ds:uri="http://purl.org/dc/elements/1.1/"/>
-    <ds:schemaRef ds:uri="http://purl.org/dc/terms/"/>
-    <ds:schemaRef ds:uri="http://schemas.microsoft.com/internal/obd"/>
+    <ds:schemaRef ds:uri="http://schemas.openxmlformats.org/officeDocument/2006/bibliography"/>
   </ds:schemaRefs>
 </ds:datastoreItem>
 </file>
</xml_diff>

<commit_message>
Hyperlink i nytt vindu
</commit_message>
<xml_diff>
--- a/arbeidshefter_r1_word/1_algebra_potenser_og_rotter.docx
+++ b/arbeidshefter_r1_word/1_algebra_potenser_og_rotter.docx
@@ -2681,7 +2681,7 @@
           <w:sz w:val="22"/>
         </w:rPr>
       </w:pPr>
-      <w:hyperlink r:id="rId15" w:history="1">
+      <w:hyperlink r:id="rId15" w:tgtFrame="_blank" w:history="1">
         <w:r>
           <w:rPr>
             <w:rStyle w:val="Hyperkobling"/>
@@ -2701,15 +2701,7 @@
             <w:rStyle w:val="Hyperkobling"/>
             <w:sz w:val="22"/>
           </w:rPr>
-          <w:t xml:space="preserve"> (</w:t>
-        </w:r>
-        <w:proofErr w:type="gramStart"/>
-        <w:r>
-          <w:rPr>
-            <w:rStyle w:val="Hyperkobling"/>
-            <w:sz w:val="22"/>
-          </w:rPr>
-          <w:t>li</w:t>
+          <w:t xml:space="preserve"> (li</w:t>
         </w:r>
         <w:r>
           <w:rPr>
@@ -2723,15 +2715,7 @@
             <w:rStyle w:val="Hyperkobling"/>
             <w:sz w:val="22"/>
           </w:rPr>
-          <w:t>k</w:t>
-        </w:r>
-        <w:proofErr w:type="gramEnd"/>
-        <w:r>
-          <w:rPr>
-            <w:rStyle w:val="Hyperkobling"/>
-            <w:sz w:val="22"/>
-          </w:rPr>
-          <w:t>)</w:t>
+          <w:t>k)</w:t>
         </w:r>
       </w:hyperlink>
     </w:p>
@@ -4639,7 +4623,6 @@
         <w:t xml:space="preserve">Trekk ut så mye som mulig fra </w:t>
       </w:r>
       <w:proofErr w:type="spellStart"/>
-      <w:proofErr w:type="gramStart"/>
       <w:r>
         <w:rPr>
           <w:rFonts w:eastAsiaTheme="minorEastAsia"/>
@@ -4655,16 +4638,7 @@
           <w:sz w:val="24"/>
           <w:szCs w:val="24"/>
         </w:rPr>
-        <w:t xml:space="preserve">  (</w:t>
-      </w:r>
-      <w:proofErr w:type="gramEnd"/>
-      <w:r>
-        <w:rPr>
-          <w:rFonts w:eastAsiaTheme="minorEastAsia"/>
-          <w:sz w:val="24"/>
-          <w:szCs w:val="24"/>
-        </w:rPr>
-        <w:t xml:space="preserve">Eksempel: </w:t>
+        <w:t xml:space="preserve">  (Eksempel: </w:t>
       </w:r>
       <m:oMath>
         <m:rad>

</xml_diff>

<commit_message>
Lagt inn linker til løsninger
</commit_message>
<xml_diff>
--- a/arbeidshefter_r1_word/1_algebra_potenser_og_rotter.docx
+++ b/arbeidshefter_r1_word/1_algebra_potenser_og_rotter.docx
@@ -2522,6 +2522,9 @@
           <w:ilvl w:val="0"/>
           <w:numId w:val="28"/>
         </w:numPr>
+        <w:tabs>
+          <w:tab w:val="right" w:pos="3969"/>
+        </w:tabs>
         <w:rPr>
           <w:szCs w:val="24"/>
         </w:rPr>
@@ -2672,50 +2675,41 @@
           </m:sup>
         </m:sSup>
       </m:oMath>
-    </w:p>
-    <w:p>
-      <w:pPr>
-        <w:pStyle w:val="Brdtekst"/>
-        <w:ind w:left="360"/>
-        <w:rPr>
-          <w:sz w:val="22"/>
-        </w:rPr>
-      </w:pPr>
+      <w:r>
+        <w:rPr>
+          <w:szCs w:val="24"/>
+        </w:rPr>
+        <w:t xml:space="preserve"> </w:t>
+      </w:r>
+      <w:r>
+        <w:rPr>
+          <w:szCs w:val="24"/>
+        </w:rPr>
+        <w:tab/>
+      </w:r>
       <w:hyperlink r:id="rId15" w:tgtFrame="_blank" w:history="1">
         <w:r>
           <w:rPr>
             <w:rStyle w:val="Hyperkobling"/>
             <w:sz w:val="22"/>
           </w:rPr>
-          <w:t>Løsninge</w:t>
+          <w:t>Løsning (</w:t>
         </w:r>
+        <w:proofErr w:type="gramStart"/>
         <w:r>
           <w:rPr>
             <w:rStyle w:val="Hyperkobling"/>
             <w:sz w:val="22"/>
           </w:rPr>
-          <w:t>r</w:t>
+          <w:t>link</w:t>
         </w:r>
+        <w:proofErr w:type="gramEnd"/>
         <w:r>
           <w:rPr>
             <w:rStyle w:val="Hyperkobling"/>
             <w:sz w:val="22"/>
           </w:rPr>
-          <w:t xml:space="preserve"> (li</w:t>
-        </w:r>
-        <w:r>
-          <w:rPr>
-            <w:rStyle w:val="Hyperkobling"/>
-            <w:sz w:val="22"/>
-          </w:rPr>
-          <w:t>n</w:t>
-        </w:r>
-        <w:r>
-          <w:rPr>
-            <w:rStyle w:val="Hyperkobling"/>
-            <w:sz w:val="22"/>
-          </w:rPr>
-          <w:t>k)</w:t>
+          <w:t>)</w:t>
         </w:r>
       </w:hyperlink>
     </w:p>
@@ -3284,6 +3278,9 @@
           <w:ilvl w:val="0"/>
           <w:numId w:val="6"/>
         </w:numPr>
+        <w:tabs>
+          <w:tab w:val="right" w:pos="3969"/>
+        </w:tabs>
         <w:spacing w:line="360" w:lineRule="auto"/>
         <w:rPr>
           <w:szCs w:val="24"/>
@@ -3528,6 +3525,37 @@
           </m:den>
         </m:f>
       </m:oMath>
+      <w:r>
+        <w:rPr>
+          <w:sz w:val="22"/>
+        </w:rPr>
+        <w:tab/>
+      </w:r>
+      <w:hyperlink r:id="rId16" w:history="1">
+        <w:r>
+          <w:rPr>
+            <w:rStyle w:val="Hyperkobling"/>
+            <w:sz w:val="22"/>
+          </w:rPr>
+          <w:t>Løsning (</w:t>
+        </w:r>
+        <w:proofErr w:type="gramStart"/>
+        <w:r>
+          <w:rPr>
+            <w:rStyle w:val="Hyperkobling"/>
+            <w:sz w:val="22"/>
+          </w:rPr>
+          <w:t>link</w:t>
+        </w:r>
+        <w:proofErr w:type="gramEnd"/>
+        <w:r>
+          <w:rPr>
+            <w:rStyle w:val="Hyperkobling"/>
+            <w:sz w:val="22"/>
+          </w:rPr>
+          <w:t>)</w:t>
+        </w:r>
+      </w:hyperlink>
     </w:p>
     <w:p>
       <w:pPr>
@@ -3538,6 +3566,15 @@
           <w:szCs w:val="24"/>
         </w:rPr>
       </w:pPr>
+      <w:r>
+        <w:rPr>
+          <w:b/>
+          <w:bCs/>
+          <w:sz w:val="24"/>
+          <w:szCs w:val="24"/>
+        </w:rPr>
+        <w:br w:type="column"/>
+      </w:r>
       <w:r>
         <w:rPr>
           <w:b/>
@@ -4575,6 +4612,49 @@
     </w:p>
     <w:p>
       <w:pPr>
+        <w:pStyle w:val="Brdtekst"/>
+        <w:tabs>
+          <w:tab w:val="right" w:pos="3969"/>
+        </w:tabs>
+        <w:spacing w:line="360" w:lineRule="auto"/>
+        <w:rPr>
+          <w:szCs w:val="24"/>
+        </w:rPr>
+      </w:pPr>
+      <w:r>
+        <w:rPr>
+          <w:sz w:val="22"/>
+        </w:rPr>
+        <w:tab/>
+      </w:r>
+      <w:hyperlink r:id="rId17" w:history="1">
+        <w:r>
+          <w:rPr>
+            <w:rStyle w:val="Hyperkobling"/>
+            <w:sz w:val="22"/>
+          </w:rPr>
+          <w:t>Løsning (</w:t>
+        </w:r>
+        <w:proofErr w:type="gramStart"/>
+        <w:r>
+          <w:rPr>
+            <w:rStyle w:val="Hyperkobling"/>
+            <w:sz w:val="22"/>
+          </w:rPr>
+          <w:t>link</w:t>
+        </w:r>
+        <w:proofErr w:type="gramEnd"/>
+        <w:r>
+          <w:rPr>
+            <w:rStyle w:val="Hyperkobling"/>
+            <w:sz w:val="22"/>
+          </w:rPr>
+          <w:t>)</w:t>
+        </w:r>
+      </w:hyperlink>
+    </w:p>
+    <w:p>
+      <w:pPr>
         <w:spacing w:line="360" w:lineRule="auto"/>
         <w:rPr>
           <w:rFonts w:eastAsiaTheme="minorEastAsia"/>
@@ -4623,6 +4703,7 @@
         <w:t xml:space="preserve">Trekk ut så mye som mulig fra </w:t>
       </w:r>
       <w:proofErr w:type="spellStart"/>
+      <w:proofErr w:type="gramStart"/>
       <w:r>
         <w:rPr>
           <w:rFonts w:eastAsiaTheme="minorEastAsia"/>
@@ -4638,7 +4719,16 @@
           <w:sz w:val="24"/>
           <w:szCs w:val="24"/>
         </w:rPr>
-        <w:t xml:space="preserve">  (Eksempel: </w:t>
+        <w:t xml:space="preserve">  (</w:t>
+      </w:r>
+      <w:proofErr w:type="gramEnd"/>
+      <w:r>
+        <w:rPr>
+          <w:rFonts w:eastAsiaTheme="minorEastAsia"/>
+          <w:sz w:val="24"/>
+          <w:szCs w:val="24"/>
+        </w:rPr>
+        <w:t xml:space="preserve">Eksempel: </w:t>
       </w:r>
       <m:oMath>
         <m:rad>
@@ -4869,6 +4959,9 @@
           <w:ilvl w:val="0"/>
           <w:numId w:val="2"/>
         </w:numPr>
+        <w:tabs>
+          <w:tab w:val="right" w:pos="3969"/>
+        </w:tabs>
         <w:spacing w:line="360" w:lineRule="auto"/>
         <w:rPr>
           <w:rFonts w:eastAsiaTheme="minorEastAsia"/>
@@ -4902,6 +4995,34 @@
           </m:e>
         </m:rad>
       </m:oMath>
+      <w:r>
+        <w:t xml:space="preserve"> </w:t>
+      </w:r>
+      <w:r>
+        <w:tab/>
+      </w:r>
+      <w:hyperlink r:id="rId18" w:history="1">
+        <w:r>
+          <w:rPr>
+            <w:rStyle w:val="Hyperkobling"/>
+          </w:rPr>
+          <w:t>Løsning (</w:t>
+        </w:r>
+        <w:proofErr w:type="gramStart"/>
+        <w:r>
+          <w:rPr>
+            <w:rStyle w:val="Hyperkobling"/>
+          </w:rPr>
+          <w:t>link</w:t>
+        </w:r>
+        <w:proofErr w:type="gramEnd"/>
+        <w:r>
+          <w:rPr>
+            <w:rStyle w:val="Hyperkobling"/>
+          </w:rPr>
+          <w:t>)</w:t>
+        </w:r>
+      </w:hyperlink>
     </w:p>
     <w:p>
       <w:pPr>
@@ -5348,6 +5469,9 @@
           <w:ilvl w:val="0"/>
           <w:numId w:val="1"/>
         </w:numPr>
+        <w:tabs>
+          <w:tab w:val="right" w:pos="3969"/>
+        </w:tabs>
         <w:spacing w:line="360" w:lineRule="auto"/>
         <w:rPr>
           <w:rFonts w:eastAsiaTheme="minorEastAsia"/>
@@ -5421,6 +5545,44 @@
           </m:sup>
         </m:sSup>
       </m:oMath>
+      <w:r>
+        <w:rPr>
+          <w:rFonts w:eastAsiaTheme="minorEastAsia"/>
+          <w:sz w:val="24"/>
+          <w:szCs w:val="24"/>
+        </w:rPr>
+        <w:t xml:space="preserve"> </w:t>
+      </w:r>
+      <w:r>
+        <w:rPr>
+          <w:rFonts w:eastAsiaTheme="minorEastAsia"/>
+          <w:sz w:val="24"/>
+          <w:szCs w:val="24"/>
+        </w:rPr>
+        <w:tab/>
+      </w:r>
+      <w:hyperlink r:id="rId19" w:history="1">
+        <w:r>
+          <w:rPr>
+            <w:rStyle w:val="Hyperkobling"/>
+          </w:rPr>
+          <w:t>Løsning (</w:t>
+        </w:r>
+        <w:proofErr w:type="gramStart"/>
+        <w:r>
+          <w:rPr>
+            <w:rStyle w:val="Hyperkobling"/>
+          </w:rPr>
+          <w:t>link</w:t>
+        </w:r>
+        <w:proofErr w:type="gramEnd"/>
+        <w:r>
+          <w:rPr>
+            <w:rStyle w:val="Hyperkobling"/>
+          </w:rPr>
+          <w:t>)</w:t>
+        </w:r>
+      </w:hyperlink>
     </w:p>
     <w:p>
       <w:pPr>
@@ -7021,7 +7183,7 @@
                     <pic:cNvPicPr/>
                   </pic:nvPicPr>
                   <pic:blipFill>
-                    <a:blip r:embed="rId16"/>
+                    <a:blip r:embed="rId20"/>
                     <a:stretch>
                       <a:fillRect/>
                     </a:stretch>
@@ -7091,7 +7253,7 @@
                     <pic:cNvPicPr/>
                   </pic:nvPicPr>
                   <pic:blipFill>
-                    <a:blip r:embed="rId17"/>
+                    <a:blip r:embed="rId21"/>
                     <a:stretch>
                       <a:fillRect/>
                     </a:stretch>
@@ -7168,7 +7330,7 @@
                     <pic:cNvPicPr/>
                   </pic:nvPicPr>
                   <pic:blipFill>
-                    <a:blip r:embed="rId18"/>
+                    <a:blip r:embed="rId22"/>
                     <a:stretch>
                       <a:fillRect/>
                     </a:stretch>
@@ -7238,7 +7400,7 @@
                     <pic:cNvPicPr/>
                   </pic:nvPicPr>
                   <pic:blipFill>
-                    <a:blip r:embed="rId19"/>
+                    <a:blip r:embed="rId23"/>
                     <a:stretch>
                       <a:fillRect/>
                     </a:stretch>
@@ -7306,7 +7468,7 @@
                     <pic:cNvPicPr/>
                   </pic:nvPicPr>
                   <pic:blipFill>
-                    <a:blip r:embed="rId20"/>
+                    <a:blip r:embed="rId24"/>
                     <a:stretch>
                       <a:fillRect/>
                     </a:stretch>
@@ -7394,7 +7556,7 @@
                     <pic:cNvPicPr/>
                   </pic:nvPicPr>
                   <pic:blipFill>
-                    <a:blip r:embed="rId21"/>
+                    <a:blip r:embed="rId25"/>
                     <a:stretch>
                       <a:fillRect/>
                     </a:stretch>
@@ -7464,7 +7626,7 @@
                     <pic:cNvPicPr/>
                   </pic:nvPicPr>
                   <pic:blipFill>
-                    <a:blip r:embed="rId22"/>
+                    <a:blip r:embed="rId26"/>
                     <a:stretch>
                       <a:fillRect/>
                     </a:stretch>
@@ -7532,7 +7694,7 @@
                     <pic:cNvPicPr/>
                   </pic:nvPicPr>
                   <pic:blipFill>
-                    <a:blip r:embed="rId23"/>
+                    <a:blip r:embed="rId27"/>
                     <a:stretch>
                       <a:fillRect/>
                     </a:stretch>
@@ -7595,7 +7757,7 @@
                     <pic:cNvPicPr/>
                   </pic:nvPicPr>
                   <pic:blipFill>
-                    <a:blip r:embed="rId24"/>
+                    <a:blip r:embed="rId28"/>
                     <a:stretch>
                       <a:fillRect/>
                     </a:stretch>
@@ -7663,7 +7825,7 @@
                     <pic:cNvPicPr/>
                   </pic:nvPicPr>
                   <pic:blipFill>
-                    <a:blip r:embed="rId25"/>
+                    <a:blip r:embed="rId29"/>
                     <a:stretch>
                       <a:fillRect/>
                     </a:stretch>
@@ -7728,7 +7890,7 @@
                     <pic:cNvPicPr/>
                   </pic:nvPicPr>
                   <pic:blipFill>
-                    <a:blip r:embed="rId26"/>
+                    <a:blip r:embed="rId30"/>
                     <a:stretch>
                       <a:fillRect/>
                     </a:stretch>
@@ -7796,7 +7958,7 @@
                     <pic:cNvPicPr/>
                   </pic:nvPicPr>
                   <pic:blipFill>
-                    <a:blip r:embed="rId27"/>
+                    <a:blip r:embed="rId31"/>
                     <a:stretch>
                       <a:fillRect/>
                     </a:stretch>
@@ -7850,7 +8012,7 @@
                     <pic:cNvPicPr/>
                   </pic:nvPicPr>
                   <pic:blipFill>
-                    <a:blip r:embed="rId28"/>
+                    <a:blip r:embed="rId32"/>
                     <a:stretch>
                       <a:fillRect/>
                     </a:stretch>
@@ -7918,7 +8080,7 @@
                     <pic:cNvPicPr/>
                   </pic:nvPicPr>
                   <pic:blipFill>
-                    <a:blip r:embed="rId29"/>
+                    <a:blip r:embed="rId33"/>
                     <a:stretch>
                       <a:fillRect/>
                     </a:stretch>
@@ -7987,7 +8149,7 @@
                     <pic:cNvPicPr/>
                   </pic:nvPicPr>
                   <pic:blipFill>
-                    <a:blip r:embed="rId30"/>
+                    <a:blip r:embed="rId34"/>
                     <a:stretch>
                       <a:fillRect/>
                     </a:stretch>
@@ -8041,7 +8203,7 @@
                     <pic:cNvPicPr/>
                   </pic:nvPicPr>
                   <pic:blipFill>
-                    <a:blip r:embed="rId31"/>
+                    <a:blip r:embed="rId35"/>
                     <a:stretch>
                       <a:fillRect/>
                     </a:stretch>
@@ -8105,7 +8267,7 @@
                     <pic:cNvPicPr/>
                   </pic:nvPicPr>
                   <pic:blipFill>
-                    <a:blip r:embed="rId32"/>
+                    <a:blip r:embed="rId36"/>
                     <a:stretch>
                       <a:fillRect/>
                     </a:stretch>
@@ -8169,7 +8331,7 @@
                     <pic:cNvPicPr/>
                   </pic:nvPicPr>
                   <pic:blipFill>
-                    <a:blip r:embed="rId33"/>
+                    <a:blip r:embed="rId37"/>
                     <a:stretch>
                       <a:fillRect/>
                     </a:stretch>
@@ -15732,6 +15894,18 @@
 </file>
 
 <file path=customXml/item2.xml><?xml version="1.0" encoding="utf-8"?>
+<b:Sources xmlns:b="http://schemas.openxmlformats.org/officeDocument/2006/bibliography" xmlns="http://schemas.openxmlformats.org/officeDocument/2006/bibliography" SelectedStyle="\APASixthEditionOfficeOnline.xsl" StyleName="APA" Version="6"/>
+</file>
+
+<file path=customXml/item3.xml><?xml version="1.0" encoding="utf-8"?>
+<p:properties xmlns:p="http://schemas.microsoft.com/office/2006/metadata/properties" xmlns:xsi="http://www.w3.org/2001/XMLSchema-instance" xmlns:pc="http://schemas.microsoft.com/office/infopath/2007/PartnerControls">
+  <documentManagement>
+    <Kortbeskrivelse xmlns="17820eb2-e900-4c69-9281-707a51dd939a" xsi:nil="true"/>
+  </documentManagement>
+</p:properties>
+</file>
+
+<file path=customXml/item4.xml><?xml version="1.0" encoding="utf-8"?>
 <ct:contentTypeSchema xmlns:ct="http://schemas.microsoft.com/office/2006/metadata/contentType" xmlns:ma="http://schemas.microsoft.com/office/2006/metadata/properties/metaAttributes" ct:_="" ma:_="" ma:contentTypeName="Dokument" ma:contentTypeID="0x01010036916457F6DCE74EB55FF474EA2F3FD3" ma:contentTypeVersion="5" ma:contentTypeDescription="Opprett et nytt dokument." ma:contentTypeScope="" ma:versionID="e590dc1b09dbcff83d06c0235457f097">
   <xsd:schema xmlns:xsd="http://www.w3.org/2001/XMLSchema" xmlns:xs="http://www.w3.org/2001/XMLSchema" xmlns:p="http://schemas.microsoft.com/office/2006/metadata/properties" xmlns:ns2="17820eb2-e900-4c69-9281-707a51dd939a" targetNamespace="http://schemas.microsoft.com/office/2006/metadata/properties" ma:root="true" ma:fieldsID="9786b617f93919eacb7b572548e019ef" ns2:_="">
     <xsd:import namespace="17820eb2-e900-4c69-9281-707a51dd939a"/>
@@ -15883,18 +16057,6 @@
 </ct:contentTypeSchema>
 </file>
 
-<file path=customXml/item3.xml><?xml version="1.0" encoding="utf-8"?>
-<p:properties xmlns:p="http://schemas.microsoft.com/office/2006/metadata/properties" xmlns:xsi="http://www.w3.org/2001/XMLSchema-instance" xmlns:pc="http://schemas.microsoft.com/office/infopath/2007/PartnerControls">
-  <documentManagement>
-    <Kortbeskrivelse xmlns="17820eb2-e900-4c69-9281-707a51dd939a" xsi:nil="true"/>
-  </documentManagement>
-</p:properties>
-</file>
-
-<file path=customXml/item4.xml><?xml version="1.0" encoding="utf-8"?>
-<b:Sources xmlns:b="http://schemas.openxmlformats.org/officeDocument/2006/bibliography" xmlns="http://schemas.openxmlformats.org/officeDocument/2006/bibliography" SelectedStyle="\APASixthEditionOfficeOnline.xsl" StyleName="APA" Version="6"/>
-</file>
-
 <file path=customXml/itemProps1.xml><?xml version="1.0" encoding="utf-8"?>
 <ds:datastoreItem xmlns:ds="http://schemas.openxmlformats.org/officeDocument/2006/customXml" ds:itemID="{4AEBD858-B2B4-4E57-B807-F2680FEBFAA6}">
   <ds:schemaRefs>
@@ -15904,6 +16066,24 @@
 </file>
 
 <file path=customXml/itemProps2.xml><?xml version="1.0" encoding="utf-8"?>
+<ds:datastoreItem xmlns:ds="http://schemas.openxmlformats.org/officeDocument/2006/customXml" ds:itemID="{47E2D707-BCE2-472C-A8E2-5C87A2D55B19}">
+  <ds:schemaRefs>
+    <ds:schemaRef ds:uri="http://schemas.openxmlformats.org/officeDocument/2006/bibliography"/>
+  </ds:schemaRefs>
+</ds:datastoreItem>
+</file>
+
+<file path=customXml/itemProps3.xml><?xml version="1.0" encoding="utf-8"?>
+<ds:datastoreItem xmlns:ds="http://schemas.openxmlformats.org/officeDocument/2006/customXml" ds:itemID="{50EA2067-A623-41E0-BF03-3E8B46F1A03D}">
+  <ds:schemaRefs>
+    <ds:schemaRef ds:uri="http://schemas.microsoft.com/office/2006/metadata/properties"/>
+    <ds:schemaRef ds:uri="http://schemas.microsoft.com/office/infopath/2007/PartnerControls"/>
+    <ds:schemaRef ds:uri="17820eb2-e900-4c69-9281-707a51dd939a"/>
+  </ds:schemaRefs>
+</ds:datastoreItem>
+</file>
+
+<file path=customXml/itemProps4.xml><?xml version="1.0" encoding="utf-8"?>
 <ds:datastoreItem xmlns:ds="http://schemas.openxmlformats.org/officeDocument/2006/customXml" ds:itemID="{F8207D99-D5C0-474F-A208-2F1ABDF114DE}">
   <ds:schemaRefs>
     <ds:schemaRef ds:uri="http://schemas.microsoft.com/office/2006/metadata/contentType"/>
@@ -15919,22 +16099,4 @@
     <ds:schemaRef ds:uri="http://schemas.microsoft.com/internal/obd"/>
   </ds:schemaRefs>
 </ds:datastoreItem>
-</file>
-
-<file path=customXml/itemProps3.xml><?xml version="1.0" encoding="utf-8"?>
-<ds:datastoreItem xmlns:ds="http://schemas.openxmlformats.org/officeDocument/2006/customXml" ds:itemID="{50EA2067-A623-41E0-BF03-3E8B46F1A03D}">
-  <ds:schemaRefs>
-    <ds:schemaRef ds:uri="http://schemas.microsoft.com/office/2006/metadata/properties"/>
-    <ds:schemaRef ds:uri="http://schemas.microsoft.com/office/infopath/2007/PartnerControls"/>
-    <ds:schemaRef ds:uri="17820eb2-e900-4c69-9281-707a51dd939a"/>
-  </ds:schemaRefs>
-</ds:datastoreItem>
-</file>
-
-<file path=customXml/itemProps4.xml><?xml version="1.0" encoding="utf-8"?>
-<ds:datastoreItem xmlns:ds="http://schemas.openxmlformats.org/officeDocument/2006/customXml" ds:itemID="{47E2D707-BCE2-472C-A8E2-5C87A2D55B19}">
-  <ds:schemaRefs>
-    <ds:schemaRef ds:uri="http://schemas.openxmlformats.org/officeDocument/2006/bibliography"/>
-  </ds:schemaRefs>
-</ds:datastoreItem>
 </file>
</xml_diff>